<commit_message>
added ORCID to the CC License
</commit_message>
<xml_diff>
--- a/Manuscript_v2.docx
+++ b/Manuscript_v2.docx
@@ -489,19 +489,13 @@
         <w:rPr>
           <w:rFonts w:ascii="Calibri" w:hAnsi="Calibri" w:cs="Calibri"/>
         </w:rPr>
-        <w:t xml:space="preserve">six week, </w:t>
-      </w:r>
-      <w:r>
-        <w:rPr>
-          <w:rFonts w:ascii="Calibri" w:hAnsi="Calibri" w:cs="Calibri"/>
-        </w:rPr>
-        <w:t xml:space="preserve">twice-weekly, </w:t>
-      </w:r>
-      <w:r>
-        <w:rPr>
-          <w:rFonts w:ascii="Calibri" w:hAnsi="Calibri" w:cs="Calibri"/>
-        </w:rPr>
-        <w:t xml:space="preserve">time and volume matched </w:t>
+        <w:t>six-week, twice-weekly, time and volume-matched</w:t>
+      </w:r>
+      <w:r>
+        <w:rPr>
+          <w:rFonts w:ascii="Calibri" w:hAnsi="Calibri" w:cs="Calibri"/>
+        </w:rPr>
+        <w:t xml:space="preserve"> </w:t>
       </w:r>
       <w:r>
         <w:rPr>
@@ -1029,13 +1023,27 @@
         <w:rPr>
           <w:rFonts w:ascii="Calibri" w:hAnsi="Calibri" w:cs="Calibri"/>
         </w:rPr>
-        <w:t>on dRPE were significant</w:t>
-      </w:r>
-      <w:r>
-        <w:rPr>
-          <w:rFonts w:ascii="Calibri" w:hAnsi="Calibri" w:cs="Calibri"/>
-        </w:rPr>
-        <w:t xml:space="preserve"> with effects ranging </w:t>
+        <w:t xml:space="preserve">on </w:t>
+      </w:r>
+      <w:proofErr w:type="spellStart"/>
+      <w:r>
+        <w:rPr>
+          <w:rFonts w:ascii="Calibri" w:hAnsi="Calibri" w:cs="Calibri"/>
+        </w:rPr>
+        <w:t>dRPE</w:t>
+      </w:r>
+      <w:proofErr w:type="spellEnd"/>
+      <w:r>
+        <w:rPr>
+          <w:rFonts w:ascii="Calibri" w:hAnsi="Calibri" w:cs="Calibri"/>
+        </w:rPr>
+        <w:t xml:space="preserve"> were significant</w:t>
+      </w:r>
+      <w:r>
+        <w:rPr>
+          <w:rFonts w:ascii="Calibri" w:hAnsi="Calibri" w:cs="Calibri"/>
+        </w:rPr>
+        <w:t xml:space="preserve">, with effects ranging from </w:t>
       </w:r>
       <w:r>
         <w:rPr>
@@ -2707,13 +2715,19 @@
         <w:rPr>
           <w:rFonts w:ascii="Calibri" w:hAnsi="Calibri" w:cs="Calibri"/>
         </w:rPr>
-        <w:t xml:space="preserve"> could reduce metabolic demand and limit aerobic adaptation, whereas shorter rest duration could induce fatigue, </w:t>
-      </w:r>
-      <w:r>
-        <w:rPr>
-          <w:rFonts w:ascii="Calibri" w:hAnsi="Calibri" w:cs="Calibri"/>
-        </w:rPr>
-        <w:t xml:space="preserve">that </w:t>
+        <w:t xml:space="preserve"> could reduce metabolic demand and limit aerobic adaptation, whereas shorter rest </w:t>
+      </w:r>
+      <w:r>
+        <w:rPr>
+          <w:rFonts w:ascii="Calibri" w:hAnsi="Calibri" w:cs="Calibri"/>
+        </w:rPr>
+        <w:t>durations could induce fatigue, which</w:t>
+      </w:r>
+      <w:r>
+        <w:rPr>
+          <w:rFonts w:ascii="Calibri" w:hAnsi="Calibri" w:cs="Calibri"/>
+        </w:rPr>
+        <w:t xml:space="preserve"> </w:t>
       </w:r>
       <w:r>
         <w:rPr>
@@ -2767,7 +2781,19 @@
         <w:rPr>
           <w:rFonts w:ascii="Calibri" w:hAnsi="Calibri" w:cs="Calibri"/>
         </w:rPr>
-        <w:t xml:space="preserve"> rest have chosen broad work:rest ratios (1:1 vs 1:6) or (1:3 vs 1:6) but with no standardised prescription for between-s</w:t>
+        <w:t xml:space="preserve"> rest have chosen broad work:rest ratios (1:1 vs 1:6) or (1:3 vs 1:6)</w:t>
+      </w:r>
+      <w:r>
+        <w:rPr>
+          <w:rFonts w:ascii="Calibri" w:hAnsi="Calibri" w:cs="Calibri"/>
+        </w:rPr>
+        <w:t>,</w:t>
+      </w:r>
+      <w:r>
+        <w:rPr>
+          <w:rFonts w:ascii="Calibri" w:hAnsi="Calibri" w:cs="Calibri"/>
+        </w:rPr>
+        <w:t xml:space="preserve"> but with no standardised prescription for between-s</w:t>
       </w:r>
       <w:r>
         <w:rPr>
@@ -3069,55 +3095,37 @@
         <w:rPr>
           <w:rFonts w:ascii="Calibri" w:hAnsi="Calibri" w:cs="Calibri"/>
         </w:rPr>
-        <w:t xml:space="preserve"> 2016) </w:t>
-      </w:r>
-      <w:r>
-        <w:rPr>
-          <w:rFonts w:ascii="Calibri" w:hAnsi="Calibri" w:cs="Calibri"/>
-        </w:rPr>
-        <w:t xml:space="preserve">such a decrement </w:t>
-      </w:r>
-      <w:r>
-        <w:rPr>
-          <w:rFonts w:ascii="Calibri" w:hAnsi="Calibri" w:cs="Calibri"/>
-        </w:rPr>
-        <w:t>has potential</w:t>
-      </w:r>
-      <w:r>
-        <w:rPr>
-          <w:rFonts w:ascii="Calibri" w:hAnsi="Calibri" w:cs="Calibri"/>
-        </w:rPr>
-        <w:t xml:space="preserve"> to </w:t>
-      </w:r>
-      <w:r>
-        <w:rPr>
-          <w:rFonts w:ascii="Calibri" w:hAnsi="Calibri" w:cs="Calibri"/>
-        </w:rPr>
-        <w:t xml:space="preserve">cause disparity between the prescribed </w:t>
-      </w:r>
-      <w:r>
-        <w:rPr>
-          <w:rFonts w:ascii="Calibri" w:hAnsi="Calibri" w:cs="Calibri"/>
-        </w:rPr>
-        <w:t xml:space="preserve">training </w:t>
-      </w:r>
-      <w:r>
-        <w:rPr>
-          <w:rFonts w:ascii="Calibri" w:hAnsi="Calibri" w:cs="Calibri"/>
-        </w:rPr>
-        <w:t xml:space="preserve">dose and the </w:t>
-      </w:r>
-      <w:r>
-        <w:rPr>
-          <w:rFonts w:ascii="Calibri" w:hAnsi="Calibri" w:cs="Calibri"/>
-        </w:rPr>
-        <w:t xml:space="preserve">training </w:t>
-      </w:r>
-      <w:r>
-        <w:rPr>
-          <w:rFonts w:ascii="Calibri" w:hAnsi="Calibri" w:cs="Calibri"/>
-        </w:rPr>
-        <w:t>response</w:t>
+        <w:t xml:space="preserve"> 2016)</w:t>
+      </w:r>
+      <w:r>
+        <w:rPr>
+          <w:rFonts w:ascii="Calibri" w:hAnsi="Calibri" w:cs="Calibri"/>
+        </w:rPr>
+        <w:t xml:space="preserve">, such a decrement has the potential to cause disparity between the prescribed training dose and the training response, which could result in </w:t>
+      </w:r>
+      <w:r>
+        <w:rPr>
+          <w:rFonts w:ascii="Calibri" w:hAnsi="Calibri" w:cs="Calibri"/>
+        </w:rPr>
+        <w:t xml:space="preserve">players failing to </w:t>
+      </w:r>
+      <w:r>
+        <w:rPr>
+          <w:rFonts w:ascii="Calibri" w:hAnsi="Calibri" w:cs="Calibri"/>
+        </w:rPr>
+        <w:t>meet</w:t>
+      </w:r>
+      <w:r>
+        <w:rPr>
+          <w:rFonts w:ascii="Calibri" w:hAnsi="Calibri" w:cs="Calibri"/>
+        </w:rPr>
+        <w:t xml:space="preserve"> the aims of their repeated-sprint training sessions</w:t>
+      </w:r>
+      <w:r>
+        <w:rPr>
+          <w:rFonts w:ascii="Calibri" w:hAnsi="Calibri" w:cs="Calibri"/>
+        </w:rPr>
+        <w:t>.</w:t>
       </w:r>
       <w:r>
         <w:rPr>
@@ -3129,43 +3137,25 @@
         <w:rPr>
           <w:rFonts w:ascii="Calibri" w:hAnsi="Calibri" w:cs="Calibri"/>
         </w:rPr>
-        <w:t xml:space="preserve">which could result players failing to </w:t>
-      </w:r>
-      <w:r>
-        <w:rPr>
-          <w:rFonts w:ascii="Calibri" w:hAnsi="Calibri" w:cs="Calibri"/>
-        </w:rPr>
-        <w:t>meet</w:t>
-      </w:r>
-      <w:r>
-        <w:rPr>
-          <w:rFonts w:ascii="Calibri" w:hAnsi="Calibri" w:cs="Calibri"/>
-        </w:rPr>
-        <w:t xml:space="preserve"> the aims of their repeated-sprint training sessions</w:t>
-      </w:r>
-      <w:r>
-        <w:rPr>
-          <w:rFonts w:ascii="Calibri" w:hAnsi="Calibri" w:cs="Calibri"/>
-        </w:rPr>
-        <w:t>.</w:t>
-      </w:r>
-      <w:r>
-        <w:rPr>
-          <w:rFonts w:ascii="Calibri" w:hAnsi="Calibri" w:cs="Calibri"/>
-        </w:rPr>
-        <w:t xml:space="preserve"> </w:t>
-      </w:r>
-      <w:r>
-        <w:rPr>
-          <w:rFonts w:ascii="Calibri" w:hAnsi="Calibri" w:cs="Calibri"/>
-        </w:rPr>
         <w:t xml:space="preserve">The potential impact of </w:t>
       </w:r>
       <w:r>
         <w:rPr>
           <w:rFonts w:ascii="Calibri" w:hAnsi="Calibri" w:cs="Calibri"/>
         </w:rPr>
-        <w:t>manipulating repeated sprint within- and between-set rest intervals therefore warrants further examination</w:t>
+        <w:t>manipulating repeated sprint within- and between-set rest intervals</w:t>
+      </w:r>
+      <w:r>
+        <w:rPr>
+          <w:rFonts w:ascii="Calibri" w:hAnsi="Calibri" w:cs="Calibri"/>
+        </w:rPr>
+        <w:t>, therefore,</w:t>
+      </w:r>
+      <w:r>
+        <w:rPr>
+          <w:rFonts w:ascii="Calibri" w:hAnsi="Calibri" w:cs="Calibri"/>
+        </w:rPr>
+        <w:t xml:space="preserve"> warrants further examination</w:t>
       </w:r>
       <w:r>
         <w:rPr>
@@ -3280,6 +3270,12 @@
           <w:rFonts w:ascii="Calibri" w:hAnsi="Calibri" w:cs="Calibri"/>
         </w:rPr>
         <w:t xml:space="preserve">fitness </w:t>
+      </w:r>
+      <w:r>
+        <w:rPr>
+          <w:rFonts w:ascii="Calibri" w:hAnsi="Calibri" w:cs="Calibri"/>
+        </w:rPr>
+        <w:t xml:space="preserve">of </w:t>
       </w:r>
       <w:r>
         <w:rPr>
@@ -3416,61 +3412,19 @@
         <w:rPr>
           <w:rFonts w:ascii="Calibri" w:hAnsi="Calibri" w:cs="Calibri"/>
         </w:rPr>
-        <w:t xml:space="preserve"> The only deviation to the original protocol</w:t>
-      </w:r>
-      <w:r>
-        <w:rPr>
-          <w:rFonts w:ascii="Calibri" w:hAnsi="Calibri" w:cs="Calibri"/>
-        </w:rPr>
-        <w:t xml:space="preserve"> or </w:t>
-      </w:r>
-      <w:r>
-        <w:rPr>
-          <w:rFonts w:ascii="Calibri" w:hAnsi="Calibri" w:cs="Calibri"/>
-        </w:rPr>
-        <w:t xml:space="preserve">planned </w:t>
-      </w:r>
-      <w:r>
-        <w:rPr>
-          <w:rFonts w:ascii="Calibri" w:hAnsi="Calibri" w:cs="Calibri"/>
-        </w:rPr>
-        <w:t>analysis</w:t>
-      </w:r>
-      <w:r>
-        <w:rPr>
-          <w:rFonts w:ascii="Calibri" w:hAnsi="Calibri" w:cs="Calibri"/>
-        </w:rPr>
-        <w:t xml:space="preserve"> </w:t>
-      </w:r>
-      <w:r>
-        <w:rPr>
-          <w:rFonts w:ascii="Calibri" w:hAnsi="Calibri" w:cs="Calibri"/>
-        </w:rPr>
-        <w:t>was</w:t>
-      </w:r>
-      <w:r>
-        <w:rPr>
-          <w:rFonts w:ascii="Calibri" w:hAnsi="Calibri" w:cs="Calibri"/>
-        </w:rPr>
-        <w:t xml:space="preserve"> the inclusion of a </w:t>
-      </w:r>
-      <w:r>
-        <w:rPr>
-          <w:rFonts w:ascii="Calibri" w:hAnsi="Calibri" w:cs="Calibri"/>
-        </w:rPr>
-        <w:t>1</w:t>
-      </w:r>
-      <w:r>
-        <w:rPr>
-          <w:rFonts w:ascii="Calibri" w:hAnsi="Calibri" w:cs="Calibri"/>
-        </w:rPr>
-        <w:t>0 m sprint</w:t>
-      </w:r>
-      <w:r>
-        <w:rPr>
-          <w:rFonts w:ascii="Calibri" w:hAnsi="Calibri" w:cs="Calibri"/>
-        </w:rPr>
-        <w:t xml:space="preserve"> test which was an extension of the originally planned </w:t>
+        <w:t xml:space="preserve"> The only deviation </w:t>
+      </w:r>
+      <w:r>
+        <w:rPr>
+          <w:rFonts w:ascii="Calibri" w:hAnsi="Calibri" w:cs="Calibri"/>
+        </w:rPr>
+        <w:t>from the original protocol or planned analysis was the inclusion of a 10 m sprint test,</w:t>
+      </w:r>
+      <w:r>
+        <w:rPr>
+          <w:rFonts w:ascii="Calibri" w:hAnsi="Calibri" w:cs="Calibri"/>
+        </w:rPr>
+        <w:t xml:space="preserve"> which was an extension of the originally planned </w:t>
       </w:r>
       <w:r>
         <w:rPr>
@@ -3704,6 +3658,12 @@
         <w:rPr>
           <w:rFonts w:ascii="Calibri" w:hAnsi="Calibri" w:cs="Calibri"/>
         </w:rPr>
+        <w:t>,</w:t>
+      </w:r>
+      <w:r>
+        <w:rPr>
+          <w:rFonts w:ascii="Calibri" w:hAnsi="Calibri" w:cs="Calibri"/>
+        </w:rPr>
         <w:t xml:space="preserve"> with the exercise intervention</w:t>
       </w:r>
       <w:r>
@@ -4310,7 +4270,19 @@
         <w:rPr>
           <w:rFonts w:ascii="Calibri" w:hAnsi="Calibri" w:cs="Calibri"/>
         </w:rPr>
-        <w:t xml:space="preserve">sprint training protocols, ensuring 72 hours recovery between sessions. </w:t>
+        <w:t xml:space="preserve">sprint training protocols, ensuring 72 hours </w:t>
+      </w:r>
+      <w:r>
+        <w:rPr>
+          <w:rFonts w:ascii="Calibri" w:hAnsi="Calibri" w:cs="Calibri"/>
+        </w:rPr>
+        <w:t xml:space="preserve">of </w:t>
+      </w:r>
+      <w:r>
+        <w:rPr>
+          <w:rFonts w:ascii="Calibri" w:hAnsi="Calibri" w:cs="Calibri"/>
+        </w:rPr>
+        <w:t xml:space="preserve">recovery between sessions. </w:t>
       </w:r>
       <w:r>
         <w:rPr>
@@ -4322,7 +4294,19 @@
         <w:rPr>
           <w:rFonts w:ascii="Calibri" w:hAnsi="Calibri" w:cs="Calibri"/>
         </w:rPr>
-        <w:t xml:space="preserve">he rest of the weekly schedule routine was kept the same as before the study so that overall training exposure was </w:t>
+        <w:t>he rest of the weekly schedule routine was kept the same as before the study</w:t>
+      </w:r>
+      <w:r>
+        <w:rPr>
+          <w:rFonts w:ascii="Calibri" w:hAnsi="Calibri" w:cs="Calibri"/>
+        </w:rPr>
+        <w:t>,</w:t>
+      </w:r>
+      <w:r>
+        <w:rPr>
+          <w:rFonts w:ascii="Calibri" w:hAnsi="Calibri" w:cs="Calibri"/>
+        </w:rPr>
+        <w:t xml:space="preserve"> so that overall training exposure was </w:t>
       </w:r>
       <w:r>
         <w:rPr>
@@ -4384,7 +4368,19 @@
         <w:rPr>
           <w:rFonts w:ascii="Calibri" w:hAnsi="Calibri" w:cs="Calibri"/>
         </w:rPr>
-        <w:t xml:space="preserve">) were time and volume matched to ensure ~4-min </w:t>
+        <w:t xml:space="preserve">) were time and </w:t>
+      </w:r>
+      <w:r>
+        <w:rPr>
+          <w:rFonts w:ascii="Calibri" w:hAnsi="Calibri" w:cs="Calibri"/>
+        </w:rPr>
+        <w:t>volume-matched</w:t>
+      </w:r>
+      <w:r>
+        <w:rPr>
+          <w:rFonts w:ascii="Calibri" w:hAnsi="Calibri" w:cs="Calibri"/>
+        </w:rPr>
+        <w:t xml:space="preserve"> to ensure ~4-min </w:t>
       </w:r>
       <w:r>
         <w:rPr>
@@ -4560,7 +4556,13 @@
         <w:rPr>
           <w:rFonts w:ascii="Calibri" w:hAnsi="Calibri" w:cs="Calibri"/>
         </w:rPr>
-        <w:t xml:space="preserve"> and across the intervention the players </w:t>
+        <w:t>. Across the intervention,</w:t>
+      </w:r>
+      <w:r>
+        <w:rPr>
+          <w:rFonts w:ascii="Calibri" w:hAnsi="Calibri" w:cs="Calibri"/>
+        </w:rPr>
+        <w:t xml:space="preserve"> the players </w:t>
       </w:r>
       <w:r>
         <w:rPr>
@@ -6202,7 +6204,19 @@
         <w:rPr>
           <w:rFonts w:ascii="Calibri" w:hAnsi="Calibri" w:cs="Calibri"/>
         </w:rPr>
-        <w:t xml:space="preserve">intervention and administered by the first author of this study who </w:t>
+        <w:t>intervention and administered by the first author of this study</w:t>
+      </w:r>
+      <w:r>
+        <w:rPr>
+          <w:rFonts w:ascii="Calibri" w:hAnsi="Calibri" w:cs="Calibri"/>
+        </w:rPr>
+        <w:t>,</w:t>
+      </w:r>
+      <w:r>
+        <w:rPr>
+          <w:rFonts w:ascii="Calibri" w:hAnsi="Calibri" w:cs="Calibri"/>
+        </w:rPr>
+        <w:t xml:space="preserve"> who </w:t>
       </w:r>
       <w:r>
         <w:rPr>
@@ -6257,6 +6271,12 @@
           <w:rFonts w:ascii="Calibri" w:hAnsi="Calibri" w:cs="Calibri"/>
         </w:rPr>
         <w:t>performed</w:t>
+      </w:r>
+      <w:r>
+        <w:rPr>
+          <w:rFonts w:ascii="Calibri" w:hAnsi="Calibri" w:cs="Calibri"/>
+        </w:rPr>
+        <w:t>,</w:t>
       </w:r>
       <w:r>
         <w:rPr>
@@ -6612,7 +6632,19 @@
         <w:rPr>
           <w:rFonts w:ascii="Calibri" w:hAnsi="Calibri" w:cs="Calibri"/>
         </w:rPr>
-        <w:t xml:space="preserve">movement depth similar over multiple attempts. The best of three trials was recorded. Assessing jump height via force plates has consistently shown good reliability (CV = 3.1 to 3.5%) </w:t>
+        <w:t xml:space="preserve">movement depth similar over multiple attempts. The best of </w:t>
+      </w:r>
+      <w:r>
+        <w:rPr>
+          <w:rFonts w:ascii="Calibri" w:hAnsi="Calibri" w:cs="Calibri"/>
+        </w:rPr>
+        <w:t xml:space="preserve">the </w:t>
+      </w:r>
+      <w:r>
+        <w:rPr>
+          <w:rFonts w:ascii="Calibri" w:hAnsi="Calibri" w:cs="Calibri"/>
+        </w:rPr>
+        <w:t xml:space="preserve">three trials was recorded. Assessing jump height via force plates has consistently shown good reliability (CV = 3.1 to 3.5%) </w:t>
       </w:r>
       <w:r>
         <w:rPr>
@@ -6789,7 +6821,19 @@
         <w:rPr>
           <w:rFonts w:ascii="Calibri" w:hAnsi="Calibri" w:cs="Calibri"/>
         </w:rPr>
-        <w:t>ingle studies are unlikely a good representation of population effect size</w:t>
+        <w:t xml:space="preserve">ingle studies are unlikely </w:t>
+      </w:r>
+      <w:r>
+        <w:rPr>
+          <w:rFonts w:ascii="Calibri" w:hAnsi="Calibri" w:cs="Calibri"/>
+        </w:rPr>
+        <w:t xml:space="preserve">to be </w:t>
+      </w:r>
+      <w:r>
+        <w:rPr>
+          <w:rFonts w:ascii="Calibri" w:hAnsi="Calibri" w:cs="Calibri"/>
+        </w:rPr>
+        <w:t>a good representation of population effect size</w:t>
       </w:r>
       <w:r>
         <w:rPr>
@@ -6831,13 +6875,19 @@
         <w:rPr>
           <w:rFonts w:ascii="Calibri" w:hAnsi="Calibri" w:cs="Calibri"/>
         </w:rPr>
-        <w:t xml:space="preserve">eta-analysis estimates are not always accurate </w:t>
-      </w:r>
-      <w:r>
-        <w:rPr>
-          <w:rFonts w:ascii="Calibri" w:hAnsi="Calibri" w:cs="Calibri"/>
-        </w:rPr>
-        <w:t xml:space="preserve">though </w:t>
+        <w:t>eta-analysis estimates are not always accurate</w:t>
+      </w:r>
+      <w:r>
+        <w:rPr>
+          <w:rFonts w:ascii="Calibri" w:hAnsi="Calibri" w:cs="Calibri"/>
+        </w:rPr>
+        <w:t>, though,</w:t>
+      </w:r>
+      <w:r>
+        <w:rPr>
+          <w:rFonts w:ascii="Calibri" w:hAnsi="Calibri" w:cs="Calibri"/>
+        </w:rPr>
+        <w:t xml:space="preserve"> </w:t>
       </w:r>
       <w:r>
         <w:rPr>
@@ -6916,6 +6966,12 @@
           <w:rFonts w:ascii="Calibri" w:hAnsi="Calibri" w:cs="Calibri"/>
         </w:rPr>
         <w:t xml:space="preserve"> study</w:t>
+      </w:r>
+      <w:r>
+        <w:rPr>
+          <w:rFonts w:ascii="Calibri" w:hAnsi="Calibri" w:cs="Calibri"/>
+        </w:rPr>
+        <w:t>,</w:t>
       </w:r>
       <w:r>
         <w:rPr>
@@ -7279,7 +7335,19 @@
         <w:rPr>
           <w:rFonts w:ascii="Calibri" w:hAnsi="Calibri" w:cs="Calibri"/>
         </w:rPr>
-        <w:t xml:space="preserve"> is likely to progress a player to the next stage which equates to a change of 0.5 km.h</w:t>
+        <w:t xml:space="preserve"> is likely to progress a player to the next stage</w:t>
+      </w:r>
+      <w:r>
+        <w:rPr>
+          <w:rFonts w:ascii="Calibri" w:hAnsi="Calibri" w:cs="Calibri"/>
+        </w:rPr>
+        <w:t>,</w:t>
+      </w:r>
+      <w:r>
+        <w:rPr>
+          <w:rFonts w:ascii="Calibri" w:hAnsi="Calibri" w:cs="Calibri"/>
+        </w:rPr>
+        <w:t xml:space="preserve"> which equates to a change of 0.5 km.h</w:t>
       </w:r>
       <w:r>
         <w:rPr>
@@ -7613,57 +7681,62 @@
         <w:rPr>
           <w:rFonts w:ascii="Calibri" w:hAnsi="Calibri" w:cs="Calibri"/>
         </w:rPr>
-        <w:t>programming variables (i.e., duration, frequency, volume, mode, sets, repetitions [number and distance]); however, the moderating effects of these programming variables w</w:t>
-      </w:r>
-      <w:r>
-        <w:rPr>
-          <w:rFonts w:ascii="Calibri" w:hAnsi="Calibri" w:cs="Calibri"/>
-        </w:rPr>
-        <w:t>as</w:t>
-      </w:r>
-      <w:r>
-        <w:rPr>
-          <w:rFonts w:ascii="Calibri" w:hAnsi="Calibri" w:cs="Calibri"/>
-        </w:rPr>
-        <w:t xml:space="preserve"> trivial or inconclusive (see Figure 11 from Thurlow et al., 2024). Forty meter sprint performance (0.17 s), maximal sprinting speed (0.4 m.s</w:t>
-      </w:r>
-      <w:r>
-        <w:rPr>
-          <w:rFonts w:ascii="Calibri" w:hAnsi="Calibri" w:cs="Calibri"/>
-          <w:vertAlign w:val="superscript"/>
-        </w:rPr>
-        <w:t>-1</w:t>
-      </w:r>
-      <w:r>
-        <w:rPr>
-          <w:rFonts w:ascii="Calibri" w:hAnsi="Calibri" w:cs="Calibri"/>
-        </w:rPr>
-        <w:t>), and maximal aerobic speed (0.26 m.s</w:t>
-      </w:r>
-      <w:r>
-        <w:rPr>
-          <w:rFonts w:ascii="Calibri" w:hAnsi="Calibri" w:cs="Calibri"/>
-          <w:vertAlign w:val="superscript"/>
-        </w:rPr>
-        <w:t>-1</w:t>
-      </w:r>
-      <w:r>
-        <w:rPr>
-          <w:rFonts w:ascii="Calibri" w:hAnsi="Calibri" w:cs="Calibri"/>
-        </w:rPr>
-        <w:t xml:space="preserve">) </w:t>
-      </w:r>
-      <w:r>
-        <w:rPr>
-          <w:rFonts w:ascii="Calibri" w:hAnsi="Calibri" w:cs="Calibri"/>
-        </w:rPr>
-        <w:t xml:space="preserve">standard deviations </w:t>
-      </w:r>
-      <w:r>
-        <w:rPr>
-          <w:rFonts w:ascii="Calibri" w:hAnsi="Calibri" w:cs="Calibri"/>
-        </w:rPr>
-        <w:t xml:space="preserve">were derived from large scale cross-sectional data on the anaerobic and aerobic performance in soccer players (Tønnessen et al., 2013; Haugen et al. 2020). Correlations between covariate (pre-test) and the dependent variable (change score) show how much variation is explained by the covariate and are </w:t>
+        <w:t xml:space="preserve">programming variables (i.e., duration, frequency, volume, mode, sets, </w:t>
+      </w:r>
+      <w:r>
+        <w:rPr>
+          <w:rFonts w:ascii="Calibri" w:hAnsi="Calibri" w:cs="Calibri"/>
+        </w:rPr>
+        <w:t xml:space="preserve">and </w:t>
+      </w:r>
+      <w:r>
+        <w:rPr>
+          <w:rFonts w:ascii="Calibri" w:hAnsi="Calibri" w:cs="Calibri"/>
+        </w:rPr>
+        <w:t xml:space="preserve">repetitions [number and distance]); however, the moderating effects of these programming variables </w:t>
+      </w:r>
+      <w:r>
+        <w:rPr>
+          <w:rFonts w:ascii="Calibri" w:hAnsi="Calibri" w:cs="Calibri"/>
+        </w:rPr>
+        <w:t>were</w:t>
+      </w:r>
+      <w:r>
+        <w:rPr>
+          <w:rFonts w:ascii="Calibri" w:hAnsi="Calibri" w:cs="Calibri"/>
+        </w:rPr>
+        <w:t xml:space="preserve"> trivial or inconclusive (see Figure 11 from Thurlow et al., 2024). </w:t>
+      </w:r>
+      <w:r>
+        <w:rPr>
+          <w:rFonts w:ascii="Calibri" w:hAnsi="Calibri" w:cs="Calibri"/>
+        </w:rPr>
+        <w:t>Forty-meter sprint performance (0.17 s), maximal sprinting speed (0.4 m.s-1), and maximal aerobic speed (0.26 m.s-1) standard deviations were derived from large-scale</w:t>
+      </w:r>
+      <w:r>
+        <w:rPr>
+          <w:rFonts w:ascii="Calibri" w:hAnsi="Calibri" w:cs="Calibri"/>
+        </w:rPr>
+        <w:t xml:space="preserve"> cross-sectional data on the anaerobic and aerobic performance in soccer players (Tønnessen et al., 2013; Haugen et al.</w:t>
+      </w:r>
+      <w:r>
+        <w:rPr>
+          <w:rFonts w:ascii="Calibri" w:hAnsi="Calibri" w:cs="Calibri"/>
+        </w:rPr>
+        <w:t>,</w:t>
+      </w:r>
+      <w:r>
+        <w:rPr>
+          <w:rFonts w:ascii="Calibri" w:hAnsi="Calibri" w:cs="Calibri"/>
+        </w:rPr>
+        <w:t xml:space="preserve"> 2020). Correlations between covariate (pre-test) and the dependent variable (change score) show how much variation is explained by the covariate and </w:t>
+      </w:r>
+      <w:r>
+        <w:rPr>
+          <w:rFonts w:ascii="Calibri" w:hAnsi="Calibri" w:cs="Calibri"/>
+        </w:rPr>
+        <w:lastRenderedPageBreak/>
+        <w:t xml:space="preserve">are </w:t>
       </w:r>
       <w:r>
         <w:rPr>
@@ -7675,86 +7748,79 @@
         <w:rPr>
           <w:rFonts w:ascii="Calibri" w:hAnsi="Calibri" w:cs="Calibri"/>
         </w:rPr>
+        <w:t xml:space="preserve"> to calculate </w:t>
+      </w:r>
+      <w:r>
+        <w:rPr>
+          <w:rFonts w:ascii="Calibri" w:hAnsi="Calibri" w:cs="Calibri"/>
+        </w:rPr>
+        <w:t xml:space="preserve">the </w:t>
+      </w:r>
+      <w:r>
+        <w:rPr>
+          <w:rFonts w:ascii="Calibri" w:hAnsi="Calibri" w:cs="Calibri"/>
+        </w:rPr>
+        <w:t xml:space="preserve">ANCOVA sample size. These correlations were calculated from the 10 m (r = 0.23), 20 m (r = -0.01), </w:t>
+      </w:r>
+      <w:r>
+        <w:rPr>
+          <w:rFonts w:ascii="Calibri" w:hAnsi="Calibri" w:cs="Calibri"/>
+        </w:rPr>
+        <w:t>CMJ</w:t>
+      </w:r>
+      <w:r>
+        <w:rPr>
+          <w:rFonts w:ascii="Calibri" w:hAnsi="Calibri" w:cs="Calibri"/>
+        </w:rPr>
+        <w:t xml:space="preserve"> (-0.31), and field-based </w:t>
+      </w:r>
+      <w:r>
+        <w:rPr>
+          <w:rFonts w:ascii="Calibri" w:hAnsi="Calibri" w:cs="Calibri"/>
+        </w:rPr>
+        <w:t xml:space="preserve">high-intensity </w:t>
+      </w:r>
+      <w:r>
+        <w:rPr>
+          <w:rFonts w:ascii="Calibri" w:hAnsi="Calibri" w:cs="Calibri"/>
+        </w:rPr>
+        <w:t xml:space="preserve">intermittent running performance (r = 0.01) data of Thurlow et al. (2024). The 20 m correlation was used for 40 m and </w:t>
+      </w:r>
+      <w:r>
+        <w:rPr>
+          <w:rFonts w:ascii="Calibri" w:hAnsi="Calibri" w:cs="Calibri"/>
+        </w:rPr>
+        <w:t>VMax</w:t>
+      </w:r>
+      <w:r>
+        <w:rPr>
+          <w:rFonts w:ascii="Calibri" w:hAnsi="Calibri" w:cs="Calibri"/>
+        </w:rPr>
+        <w:t>.</w:t>
+      </w:r>
+      <w:r>
+        <w:rPr>
+          <w:rFonts w:ascii="Calibri" w:hAnsi="Calibri" w:cs="Calibri"/>
+        </w:rPr>
         <w:t xml:space="preserve"> </w:t>
       </w:r>
       <w:r>
         <w:rPr>
           <w:rFonts w:ascii="Calibri" w:hAnsi="Calibri" w:cs="Calibri"/>
         </w:rPr>
-        <w:lastRenderedPageBreak/>
-        <w:t xml:space="preserve">to calculate ANCOVA sample size. These correlations were calculated from the 10 m (r = 0.23), 20 m (r = -0.01), </w:t>
-      </w:r>
-      <w:r>
-        <w:rPr>
-          <w:rFonts w:ascii="Calibri" w:hAnsi="Calibri" w:cs="Calibri"/>
-        </w:rPr>
-        <w:t>CMJ</w:t>
-      </w:r>
-      <w:r>
-        <w:rPr>
-          <w:rFonts w:ascii="Calibri" w:hAnsi="Calibri" w:cs="Calibri"/>
-        </w:rPr>
-        <w:t xml:space="preserve"> (-0.31), and field-based </w:t>
-      </w:r>
-      <w:r>
-        <w:rPr>
-          <w:rFonts w:ascii="Calibri" w:hAnsi="Calibri" w:cs="Calibri"/>
-        </w:rPr>
-        <w:t xml:space="preserve">high-intensity </w:t>
-      </w:r>
-      <w:r>
-        <w:rPr>
-          <w:rFonts w:ascii="Calibri" w:hAnsi="Calibri" w:cs="Calibri"/>
-        </w:rPr>
-        <w:t xml:space="preserve">intermittent running performance (r = 0.01) data of Thurlow et al. (2024). The 20 m correlation was used for 40 m and </w:t>
-      </w:r>
-      <w:r>
-        <w:rPr>
-          <w:rFonts w:ascii="Calibri" w:hAnsi="Calibri" w:cs="Calibri"/>
-        </w:rPr>
-        <w:t>VMax</w:t>
-      </w:r>
-      <w:r>
-        <w:rPr>
-          <w:rFonts w:ascii="Calibri" w:hAnsi="Calibri" w:cs="Calibri"/>
-        </w:rPr>
-        <w:t>.</w:t>
+        <w:t>Given the multicomponent nature of repeated-sprint training</w:t>
+      </w:r>
+      <w:r>
+        <w:rPr>
+          <w:rFonts w:ascii="Calibri" w:hAnsi="Calibri" w:cs="Calibri"/>
+        </w:rPr>
+        <w:t>, we have not defined a primary outcome variable; multiple fitness tests were performed,</w:t>
       </w:r>
       <w:r>
         <w:rPr>
           <w:rFonts w:ascii="Calibri" w:hAnsi="Calibri" w:cs="Calibri"/>
         </w:rPr>
         <w:t xml:space="preserve"> </w:t>
-      </w:r>
-      <w:r>
-        <w:rPr>
-          <w:rFonts w:ascii="Calibri" w:hAnsi="Calibri" w:cs="Calibri"/>
-        </w:rPr>
-        <w:t xml:space="preserve">Given the multicomponent nature of repeated-sprint training </w:t>
-      </w:r>
-      <w:r>
-        <w:rPr>
-          <w:rFonts w:ascii="Calibri" w:hAnsi="Calibri" w:cs="Calibri"/>
-        </w:rPr>
-        <w:t xml:space="preserve">we have not defined a primary outcome variable; </w:t>
-      </w:r>
-      <w:r>
-        <w:rPr>
-          <w:rFonts w:ascii="Calibri" w:hAnsi="Calibri" w:cs="Calibri"/>
-        </w:rPr>
-        <w:t>multiple fitness</w:t>
-      </w:r>
-      <w:r>
-        <w:rPr>
-          <w:rFonts w:ascii="Calibri" w:hAnsi="Calibri" w:cs="Calibri"/>
-        </w:rPr>
-        <w:t xml:space="preserve"> </w:t>
-      </w:r>
-      <w:r>
-        <w:rPr>
-          <w:rFonts w:ascii="Calibri" w:hAnsi="Calibri" w:cs="Calibri"/>
-        </w:rPr>
-        <w:t xml:space="preserve">were performed </w:t>
       </w:r>
       <w:r>
         <w:rPr>
@@ -8144,273 +8210,277 @@
         <w:rPr>
           <w:rFonts w:ascii="Calibri" w:hAnsi="Calibri" w:cs="Calibri"/>
         </w:rPr>
+        <w:t xml:space="preserve"> Masters degree dissertation. </w:t>
+      </w:r>
+      <w:r>
+        <w:rPr>
+          <w:rFonts w:ascii="Calibri" w:hAnsi="Calibri" w:cs="Calibri"/>
+        </w:rPr>
+        <w:t>Research ethics were</w:t>
+      </w:r>
+      <w:r>
+        <w:rPr>
+          <w:rFonts w:ascii="Calibri" w:hAnsi="Calibri" w:cs="Calibri"/>
+        </w:rPr>
+        <w:t xml:space="preserve"> approved in May 2024, and the dissertation deadline was August 2024</w:t>
+      </w:r>
+      <w:r>
+        <w:rPr>
+          <w:rFonts w:ascii="Calibri" w:hAnsi="Calibri" w:cs="Calibri"/>
+        </w:rPr>
+        <w:t xml:space="preserve">, </w:t>
+      </w:r>
+      <w:r>
+        <w:rPr>
+          <w:rFonts w:ascii="Calibri" w:hAnsi="Calibri" w:cs="Calibri"/>
+        </w:rPr>
+        <w:t xml:space="preserve">thus </w:t>
+      </w:r>
+      <w:r>
+        <w:rPr>
+          <w:rFonts w:ascii="Calibri" w:hAnsi="Calibri" w:cs="Calibri"/>
+        </w:rPr>
+        <w:t xml:space="preserve">giving the researcher </w:t>
+      </w:r>
+      <w:r>
+        <w:rPr>
+          <w:rFonts w:ascii="Calibri" w:hAnsi="Calibri" w:cs="Calibri"/>
+        </w:rPr>
+        <w:t>~14 weeks</w:t>
+      </w:r>
+      <w:r>
+        <w:rPr>
+          <w:rFonts w:ascii="Calibri" w:hAnsi="Calibri" w:cs="Calibri"/>
+        </w:rPr>
+        <w:t xml:space="preserve"> to complete data collection and </w:t>
+      </w:r>
+      <w:r>
+        <w:rPr>
+          <w:rFonts w:ascii="Calibri" w:hAnsi="Calibri" w:cs="Calibri"/>
+        </w:rPr>
+        <w:t xml:space="preserve">the </w:t>
+      </w:r>
+      <w:r>
+        <w:rPr>
+          <w:rFonts w:ascii="Calibri" w:hAnsi="Calibri" w:cs="Calibri"/>
+        </w:rPr>
+        <w:t>write-up</w:t>
+      </w:r>
+      <w:r>
+        <w:rPr>
+          <w:rFonts w:ascii="Calibri" w:hAnsi="Calibri" w:cs="Calibri"/>
+        </w:rPr>
+        <w:t xml:space="preserve">. </w:t>
+      </w:r>
+      <w:r>
+        <w:rPr>
+          <w:rFonts w:ascii="Calibri" w:hAnsi="Calibri" w:cs="Calibri"/>
+        </w:rPr>
+        <w:t>The population we want to generalise our findings to are semi-professional soccer players who typically have two pitch-based training sessions and one match per week</w:t>
+      </w:r>
+      <w:r>
+        <w:rPr>
+          <w:rFonts w:ascii="Calibri" w:hAnsi="Calibri" w:cs="Calibri"/>
+        </w:rPr>
+        <w:t xml:space="preserve"> and w</w:t>
+      </w:r>
+      <w:r>
+        <w:rPr>
+          <w:rFonts w:ascii="Calibri" w:hAnsi="Calibri" w:cs="Calibri"/>
+        </w:rPr>
+        <w:t>hile there are several other semi-professional teams in the geographical area of this study, the lead researcher already had access to this squad</w:t>
+      </w:r>
+      <w:r>
+        <w:rPr>
+          <w:rFonts w:ascii="Calibri" w:hAnsi="Calibri" w:cs="Calibri"/>
+        </w:rPr>
+        <w:t xml:space="preserve">, so </w:t>
+      </w:r>
+      <w:r>
+        <w:rPr>
+          <w:rFonts w:ascii="Calibri" w:hAnsi="Calibri" w:cs="Calibri"/>
+        </w:rPr>
+        <w:t>the decision was made to focus</w:t>
+      </w:r>
+      <w:r>
+        <w:rPr>
+          <w:rFonts w:ascii="Calibri" w:hAnsi="Calibri" w:cs="Calibri"/>
+        </w:rPr>
+        <w:t xml:space="preserve"> their resources on delivering</w:t>
+      </w:r>
+      <w:r>
+        <w:rPr>
+          <w:rFonts w:ascii="Calibri" w:hAnsi="Calibri" w:cs="Calibri"/>
+        </w:rPr>
+        <w:t xml:space="preserve"> and measuring the intervention</w:t>
+      </w:r>
+      <w:r>
+        <w:rPr>
+          <w:rFonts w:ascii="Calibri" w:hAnsi="Calibri" w:cs="Calibri"/>
+        </w:rPr>
+        <w:t>s</w:t>
+      </w:r>
+      <w:r>
+        <w:rPr>
+          <w:rFonts w:ascii="Calibri" w:hAnsi="Calibri" w:cs="Calibri"/>
+        </w:rPr>
+        <w:t xml:space="preserve"> across one squad</w:t>
+      </w:r>
+      <w:r>
+        <w:rPr>
+          <w:rFonts w:ascii="Calibri" w:hAnsi="Calibri" w:cs="Calibri"/>
+        </w:rPr>
+        <w:t xml:space="preserve">. This included </w:t>
+      </w:r>
+      <w:r>
+        <w:rPr>
+          <w:rFonts w:ascii="Calibri" w:hAnsi="Calibri" w:cs="Calibri"/>
+        </w:rPr>
+        <w:t xml:space="preserve">in-person </w:t>
+      </w:r>
+      <w:r>
+        <w:rPr>
+          <w:rFonts w:ascii="Calibri" w:hAnsi="Calibri" w:cs="Calibri"/>
+        </w:rPr>
+        <w:t xml:space="preserve">delivery and monitoring of all </w:t>
+      </w:r>
+      <w:r>
+        <w:rPr>
+          <w:rFonts w:ascii="Calibri" w:hAnsi="Calibri" w:cs="Calibri"/>
+        </w:rPr>
+        <w:t>intervention</w:t>
+      </w:r>
+      <w:r>
+        <w:rPr>
+          <w:rFonts w:ascii="Calibri" w:hAnsi="Calibri" w:cs="Calibri"/>
+        </w:rPr>
+        <w:t xml:space="preserve"> sessions</w:t>
+      </w:r>
+      <w:r>
+        <w:rPr>
+          <w:rFonts w:ascii="Calibri" w:hAnsi="Calibri" w:cs="Calibri"/>
+        </w:rPr>
+        <w:t>. T</w:t>
+      </w:r>
+      <w:r>
+        <w:rPr>
+          <w:rFonts w:ascii="Calibri" w:hAnsi="Calibri" w:cs="Calibri"/>
+        </w:rPr>
+        <w:t>he</w:t>
+      </w:r>
+      <w:r>
+        <w:rPr>
+          <w:rFonts w:ascii="Calibri" w:hAnsi="Calibri" w:cs="Calibri"/>
+        </w:rPr>
+        <w:t xml:space="preserve"> maximum sample size</w:t>
+      </w:r>
+      <w:r>
+        <w:rPr>
+          <w:rFonts w:ascii="Calibri" w:hAnsi="Calibri" w:cs="Calibri"/>
+        </w:rPr>
+        <w:t xml:space="preserve"> was</w:t>
+      </w:r>
+      <w:r>
+        <w:rPr>
+          <w:rFonts w:ascii="Calibri" w:hAnsi="Calibri" w:cs="Calibri"/>
+        </w:rPr>
         <w:t xml:space="preserve"> </w:t>
       </w:r>
-      <w:proofErr w:type="gramStart"/>
-      <w:r>
-        <w:rPr>
-          <w:rFonts w:ascii="Calibri" w:hAnsi="Calibri" w:cs="Calibri"/>
-        </w:rPr>
-        <w:t>Masters</w:t>
-      </w:r>
-      <w:proofErr w:type="gramEnd"/>
-      <w:r>
-        <w:rPr>
-          <w:rFonts w:ascii="Calibri" w:hAnsi="Calibri" w:cs="Calibri"/>
-        </w:rPr>
-        <w:t xml:space="preserve"> degree dissertation. </w:t>
-      </w:r>
-      <w:r>
-        <w:rPr>
-          <w:rFonts w:ascii="Calibri" w:hAnsi="Calibri" w:cs="Calibri"/>
-        </w:rPr>
-        <w:t>Research ethics were</w:t>
-      </w:r>
-      <w:r>
-        <w:rPr>
-          <w:rFonts w:ascii="Calibri" w:hAnsi="Calibri" w:cs="Calibri"/>
-        </w:rPr>
-        <w:t xml:space="preserve"> approved in May 2024, and the dissertation deadline was August 2024</w:t>
-      </w:r>
-      <w:r>
-        <w:rPr>
-          <w:rFonts w:ascii="Calibri" w:hAnsi="Calibri" w:cs="Calibri"/>
-        </w:rPr>
-        <w:t xml:space="preserve">, </w:t>
-      </w:r>
-      <w:r>
-        <w:rPr>
-          <w:rFonts w:ascii="Calibri" w:hAnsi="Calibri" w:cs="Calibri"/>
-        </w:rPr>
-        <w:t xml:space="preserve">thus </w:t>
-      </w:r>
-      <w:r>
-        <w:rPr>
-          <w:rFonts w:ascii="Calibri" w:hAnsi="Calibri" w:cs="Calibri"/>
-        </w:rPr>
-        <w:t xml:space="preserve">giving the researcher </w:t>
-      </w:r>
-      <w:r>
-        <w:rPr>
-          <w:rFonts w:ascii="Calibri" w:hAnsi="Calibri" w:cs="Calibri"/>
-        </w:rPr>
-        <w:t>~14 weeks</w:t>
-      </w:r>
-      <w:r>
-        <w:rPr>
-          <w:rFonts w:ascii="Calibri" w:hAnsi="Calibri" w:cs="Calibri"/>
-        </w:rPr>
-        <w:t xml:space="preserve"> to complete data collection and </w:t>
+      <w:r>
+        <w:rPr>
+          <w:rFonts w:ascii="Calibri" w:hAnsi="Calibri" w:cs="Calibri"/>
+        </w:rPr>
+        <w:t xml:space="preserve">therefore </w:t>
+      </w:r>
+      <w:r>
+        <w:rPr>
+          <w:rFonts w:ascii="Calibri" w:hAnsi="Calibri" w:cs="Calibri"/>
+        </w:rPr>
+        <w:t xml:space="preserve">30, </w:t>
+      </w:r>
+      <w:r>
+        <w:rPr>
+          <w:rFonts w:ascii="Calibri" w:hAnsi="Calibri" w:cs="Calibri"/>
+        </w:rPr>
+        <w:t xml:space="preserve">which </w:t>
+      </w:r>
+      <w:r>
+        <w:rPr>
+          <w:rFonts w:ascii="Calibri" w:hAnsi="Calibri" w:cs="Calibri"/>
+        </w:rPr>
+        <w:t>represent</w:t>
+      </w:r>
+      <w:r>
+        <w:rPr>
+          <w:rFonts w:ascii="Calibri" w:hAnsi="Calibri" w:cs="Calibri"/>
+        </w:rPr>
+        <w:t>s</w:t>
+      </w:r>
+      <w:r>
+        <w:rPr>
+          <w:rFonts w:ascii="Calibri" w:hAnsi="Calibri" w:cs="Calibri"/>
+        </w:rPr>
+        <w:t xml:space="preserve"> the entire squad of a </w:t>
+      </w:r>
+      <w:r>
+        <w:rPr>
+          <w:rFonts w:ascii="Calibri" w:hAnsi="Calibri" w:cs="Calibri"/>
+        </w:rPr>
+        <w:t xml:space="preserve">Scottish Lowland Semi-Professional League </w:t>
+      </w:r>
+      <w:r>
+        <w:rPr>
+          <w:rFonts w:ascii="Calibri" w:hAnsi="Calibri" w:cs="Calibri"/>
+        </w:rPr>
+        <w:t xml:space="preserve">team that the </w:t>
+      </w:r>
+      <w:r>
+        <w:rPr>
+          <w:rFonts w:ascii="Calibri" w:hAnsi="Calibri" w:cs="Calibri"/>
+        </w:rPr>
+        <w:t xml:space="preserve">researcher already </w:t>
+      </w:r>
+      <w:r>
+        <w:rPr>
+          <w:rFonts w:ascii="Calibri" w:hAnsi="Calibri" w:cs="Calibri"/>
+        </w:rPr>
+        <w:t>ha</w:t>
+      </w:r>
+      <w:r>
+        <w:rPr>
+          <w:rFonts w:ascii="Calibri" w:hAnsi="Calibri" w:cs="Calibri"/>
+        </w:rPr>
+        <w:t>d</w:t>
+      </w:r>
+      <w:r>
+        <w:rPr>
+          <w:rFonts w:ascii="Calibri" w:hAnsi="Calibri" w:cs="Calibri"/>
+        </w:rPr>
+        <w:t xml:space="preserve"> access to</w:t>
+      </w:r>
+      <w:r>
+        <w:rPr>
+          <w:rFonts w:ascii="Calibri" w:hAnsi="Calibri" w:cs="Calibri"/>
+        </w:rPr>
+        <w:t xml:space="preserve">. </w:t>
+      </w:r>
+      <w:r>
+        <w:rPr>
+          <w:rFonts w:ascii="Calibri" w:hAnsi="Calibri" w:cs="Calibri"/>
+        </w:rPr>
+        <w:t xml:space="preserve">Our eventual group sample size </w:t>
+      </w:r>
+      <w:r>
+        <w:rPr>
+          <w:rFonts w:ascii="Calibri" w:hAnsi="Calibri" w:cs="Calibri"/>
+        </w:rPr>
+        <w:t xml:space="preserve">is consistent with </w:t>
       </w:r>
       <w:r>
         <w:rPr>
           <w:rFonts w:ascii="Calibri" w:hAnsi="Calibri" w:cs="Calibri"/>
         </w:rPr>
         <w:t xml:space="preserve">the </w:t>
-      </w:r>
-      <w:r>
-        <w:rPr>
-          <w:rFonts w:ascii="Calibri" w:hAnsi="Calibri" w:cs="Calibri"/>
-        </w:rPr>
-        <w:t>write-up</w:t>
-      </w:r>
-      <w:r>
-        <w:rPr>
-          <w:rFonts w:ascii="Calibri" w:hAnsi="Calibri" w:cs="Calibri"/>
-        </w:rPr>
-        <w:t xml:space="preserve">. </w:t>
-      </w:r>
-      <w:r>
-        <w:rPr>
-          <w:rFonts w:ascii="Calibri" w:hAnsi="Calibri" w:cs="Calibri"/>
-        </w:rPr>
-        <w:t>The population we want to generalise our findings to are semi-professional soccer players who typically have two pitch-based training sessions and one match per week</w:t>
-      </w:r>
-      <w:r>
-        <w:rPr>
-          <w:rFonts w:ascii="Calibri" w:hAnsi="Calibri" w:cs="Calibri"/>
-        </w:rPr>
-        <w:t xml:space="preserve"> and w</w:t>
-      </w:r>
-      <w:r>
-        <w:rPr>
-          <w:rFonts w:ascii="Calibri" w:hAnsi="Calibri" w:cs="Calibri"/>
-        </w:rPr>
-        <w:t>hile there are several other semi-professional teams in the geographical area of this study, the lead researcher already had access to this squad</w:t>
-      </w:r>
-      <w:r>
-        <w:rPr>
-          <w:rFonts w:ascii="Calibri" w:hAnsi="Calibri" w:cs="Calibri"/>
-        </w:rPr>
-        <w:t xml:space="preserve">, so </w:t>
-      </w:r>
-      <w:r>
-        <w:rPr>
-          <w:rFonts w:ascii="Calibri" w:hAnsi="Calibri" w:cs="Calibri"/>
-        </w:rPr>
-        <w:t>the decision was made to focus</w:t>
-      </w:r>
-      <w:r>
-        <w:rPr>
-          <w:rFonts w:ascii="Calibri" w:hAnsi="Calibri" w:cs="Calibri"/>
-        </w:rPr>
-        <w:t xml:space="preserve"> their resources on delivering</w:t>
-      </w:r>
-      <w:r>
-        <w:rPr>
-          <w:rFonts w:ascii="Calibri" w:hAnsi="Calibri" w:cs="Calibri"/>
-        </w:rPr>
-        <w:t xml:space="preserve"> and measuring the intervention</w:t>
-      </w:r>
-      <w:r>
-        <w:rPr>
-          <w:rFonts w:ascii="Calibri" w:hAnsi="Calibri" w:cs="Calibri"/>
-        </w:rPr>
-        <w:t>s</w:t>
-      </w:r>
-      <w:r>
-        <w:rPr>
-          <w:rFonts w:ascii="Calibri" w:hAnsi="Calibri" w:cs="Calibri"/>
-        </w:rPr>
-        <w:t xml:space="preserve"> across one squad</w:t>
-      </w:r>
-      <w:r>
-        <w:rPr>
-          <w:rFonts w:ascii="Calibri" w:hAnsi="Calibri" w:cs="Calibri"/>
-        </w:rPr>
-        <w:t xml:space="preserve">. This included </w:t>
-      </w:r>
-      <w:r>
-        <w:rPr>
-          <w:rFonts w:ascii="Calibri" w:hAnsi="Calibri" w:cs="Calibri"/>
-        </w:rPr>
-        <w:t xml:space="preserve">in-person </w:t>
-      </w:r>
-      <w:r>
-        <w:rPr>
-          <w:rFonts w:ascii="Calibri" w:hAnsi="Calibri" w:cs="Calibri"/>
-        </w:rPr>
-        <w:t>delivery and monitoring of all interventions sessions</w:t>
-      </w:r>
-      <w:r>
-        <w:rPr>
-          <w:rFonts w:ascii="Calibri" w:hAnsi="Calibri" w:cs="Calibri"/>
-        </w:rPr>
-        <w:t>. T</w:t>
-      </w:r>
-      <w:r>
-        <w:rPr>
-          <w:rFonts w:ascii="Calibri" w:hAnsi="Calibri" w:cs="Calibri"/>
-        </w:rPr>
-        <w:t>he</w:t>
-      </w:r>
-      <w:r>
-        <w:rPr>
-          <w:rFonts w:ascii="Calibri" w:hAnsi="Calibri" w:cs="Calibri"/>
-        </w:rPr>
-        <w:t xml:space="preserve"> maximum sample size</w:t>
-      </w:r>
-      <w:r>
-        <w:rPr>
-          <w:rFonts w:ascii="Calibri" w:hAnsi="Calibri" w:cs="Calibri"/>
-        </w:rPr>
-        <w:t xml:space="preserve"> was</w:t>
-      </w:r>
-      <w:r>
-        <w:rPr>
-          <w:rFonts w:ascii="Calibri" w:hAnsi="Calibri" w:cs="Calibri"/>
-        </w:rPr>
-        <w:t xml:space="preserve"> </w:t>
-      </w:r>
-      <w:r>
-        <w:rPr>
-          <w:rFonts w:ascii="Calibri" w:hAnsi="Calibri" w:cs="Calibri"/>
-        </w:rPr>
-        <w:t xml:space="preserve">therefore </w:t>
-      </w:r>
-      <w:r>
-        <w:rPr>
-          <w:rFonts w:ascii="Calibri" w:hAnsi="Calibri" w:cs="Calibri"/>
-        </w:rPr>
-        <w:t xml:space="preserve">30, </w:t>
-      </w:r>
-      <w:r>
-        <w:rPr>
-          <w:rFonts w:ascii="Calibri" w:hAnsi="Calibri" w:cs="Calibri"/>
-        </w:rPr>
-        <w:t xml:space="preserve">which </w:t>
-      </w:r>
-      <w:r>
-        <w:rPr>
-          <w:rFonts w:ascii="Calibri" w:hAnsi="Calibri" w:cs="Calibri"/>
-        </w:rPr>
-        <w:t>represent</w:t>
-      </w:r>
-      <w:r>
-        <w:rPr>
-          <w:rFonts w:ascii="Calibri" w:hAnsi="Calibri" w:cs="Calibri"/>
-        </w:rPr>
-        <w:t>s</w:t>
-      </w:r>
-      <w:r>
-        <w:rPr>
-          <w:rFonts w:ascii="Calibri" w:hAnsi="Calibri" w:cs="Calibri"/>
-        </w:rPr>
-        <w:t xml:space="preserve"> the entire squad of a </w:t>
-      </w:r>
-      <w:r>
-        <w:rPr>
-          <w:rFonts w:ascii="Calibri" w:hAnsi="Calibri" w:cs="Calibri"/>
-        </w:rPr>
-        <w:t xml:space="preserve">Scottish Lowland Semi-Professional League </w:t>
-      </w:r>
-      <w:r>
-        <w:rPr>
-          <w:rFonts w:ascii="Calibri" w:hAnsi="Calibri" w:cs="Calibri"/>
-        </w:rPr>
-        <w:t xml:space="preserve">team that the </w:t>
-      </w:r>
-      <w:r>
-        <w:rPr>
-          <w:rFonts w:ascii="Calibri" w:hAnsi="Calibri" w:cs="Calibri"/>
-        </w:rPr>
-        <w:t xml:space="preserve">researcher already </w:t>
-      </w:r>
-      <w:r>
-        <w:rPr>
-          <w:rFonts w:ascii="Calibri" w:hAnsi="Calibri" w:cs="Calibri"/>
-        </w:rPr>
-        <w:t>ha</w:t>
-      </w:r>
-      <w:r>
-        <w:rPr>
-          <w:rFonts w:ascii="Calibri" w:hAnsi="Calibri" w:cs="Calibri"/>
-        </w:rPr>
-        <w:t>d</w:t>
-      </w:r>
-      <w:r>
-        <w:rPr>
-          <w:rFonts w:ascii="Calibri" w:hAnsi="Calibri" w:cs="Calibri"/>
-        </w:rPr>
-        <w:t xml:space="preserve"> access to</w:t>
-      </w:r>
-      <w:r>
-        <w:rPr>
-          <w:rFonts w:ascii="Calibri" w:hAnsi="Calibri" w:cs="Calibri"/>
-        </w:rPr>
-        <w:t xml:space="preserve">. </w:t>
-      </w:r>
-      <w:r>
-        <w:rPr>
-          <w:rFonts w:ascii="Calibri" w:hAnsi="Calibri" w:cs="Calibri"/>
-        </w:rPr>
-        <w:t xml:space="preserve">Our eventual group sample size </w:t>
-      </w:r>
-      <w:r>
-        <w:rPr>
-          <w:rFonts w:ascii="Calibri" w:hAnsi="Calibri" w:cs="Calibri"/>
-        </w:rPr>
-        <w:t xml:space="preserve">is consistent with </w:t>
       </w:r>
       <w:r>
         <w:rPr>
@@ -9067,46 +9137,65 @@
             <w:rStyle w:val="Hyperlink"/>
             <w:rFonts w:ascii="Calibri" w:hAnsi="Calibri" w:cs="Calibri"/>
           </w:rPr>
-          <w:t>https:/</w:t>
+          <w:t>https://github.com/PGupta-Git/Gupta_et_al_RST_Paper_Submission</w:t>
         </w:r>
+      </w:hyperlink>
+      <w:r>
+        <w:rPr>
+          <w:rFonts w:ascii="Calibri" w:hAnsi="Calibri" w:cs="Calibri"/>
+        </w:rPr>
+        <w:t xml:space="preserve"> with </w:t>
+      </w:r>
+      <w:r>
+        <w:rPr>
+          <w:rFonts w:ascii="Calibri" w:hAnsi="Calibri" w:cs="Calibri"/>
+        </w:rPr>
+        <w:t>CC BY-NC-SA 4.0</w:t>
+      </w:r>
+      <w:r>
+        <w:rPr>
+          <w:rFonts w:ascii="Calibri" w:hAnsi="Calibri" w:cs="Calibri"/>
+        </w:rPr>
+        <w:t xml:space="preserve"> License (</w:t>
+      </w:r>
+      <w:r>
+        <w:rPr>
+          <w:rFonts w:ascii="Calibri" w:hAnsi="Calibri" w:cs="Calibri"/>
+        </w:rPr>
+        <w:t>A Pragmatic, Parallel-Arm, Randomised Trial on the Effects of Two Repeated Sprint Training Protocols on Fitness Outcomes in Semi-Professional Male Soccer Players: Preliminary Report  © 2025 by Palash Gupta</w:t>
+      </w:r>
+      <w:r>
+        <w:rPr>
+          <w:rFonts w:ascii="Calibri" w:hAnsi="Calibri" w:cs="Calibri"/>
+        </w:rPr>
+        <w:t xml:space="preserve"> </w:t>
+      </w:r>
+      <w:r>
+        <w:rPr>
+          <w:rFonts w:ascii="Calibri" w:hAnsi="Calibri" w:cs="Calibri"/>
+        </w:rPr>
+        <w:t>(</w:t>
+      </w:r>
+      <w:hyperlink r:id="rId13" w:history="1">
         <w:r>
           <w:rPr>
             <w:rStyle w:val="Hyperlink"/>
             <w:rFonts w:ascii="Calibri" w:hAnsi="Calibri" w:cs="Calibri"/>
           </w:rPr>
-          <w:t>/</w:t>
-        </w:r>
-        <w:r>
-          <w:rPr>
-            <w:rStyle w:val="Hyperlink"/>
-            <w:rFonts w:ascii="Calibri" w:hAnsi="Calibri" w:cs="Calibri"/>
-          </w:rPr>
-          <w:t>github.com/PGupta-Git/Gupta_et_al_RST_Paper_Submission</w:t>
+          <w:t>https://orcid.org/0009-0000-0172-4009</w:t>
         </w:r>
       </w:hyperlink>
       <w:r>
         <w:rPr>
           <w:rFonts w:ascii="Calibri" w:hAnsi="Calibri" w:cs="Calibri"/>
         </w:rPr>
-        <w:t xml:space="preserve"> with </w:t>
-      </w:r>
-      <w:r>
-        <w:rPr>
-          <w:rFonts w:ascii="Calibri" w:hAnsi="Calibri" w:cs="Calibri"/>
-        </w:rPr>
-        <w:t>CC BY-NC-SA 4.0</w:t>
-      </w:r>
-      <w:r>
-        <w:rPr>
-          <w:rFonts w:ascii="Calibri" w:hAnsi="Calibri" w:cs="Calibri"/>
-        </w:rPr>
-        <w:t xml:space="preserve"> License (</w:t>
-      </w:r>
-      <w:r>
-        <w:rPr>
-          <w:rFonts w:ascii="Calibri" w:hAnsi="Calibri" w:cs="Calibri"/>
-        </w:rPr>
-        <w:t>A Pragmatic, Parallel-Arm, Randomised Trial on the Effects of Two Repeated Sprint Training Protocols on Fitness Outcomes in Semi-Professional Male Soccer Players: Preliminary Report  © 2025 by Palash Gupta is licensed under Creative Commons Attribution-</w:t>
+        <w:t>)</w:t>
+      </w:r>
+      <w:r>
+        <w:rPr>
+          <w:rFonts w:ascii="Calibri" w:hAnsi="Calibri" w:cs="Calibri"/>
+        </w:rPr>
+        <w:t xml:space="preserve"> is licensed under Creative Commons Attribution-</w:t>
       </w:r>
       <w:proofErr w:type="spellStart"/>
       <w:r>
@@ -9136,7 +9225,7 @@
         </w:rPr>
         <w:t xml:space="preserve"> 4.0 International. To view a copy of this license, visit </w:t>
       </w:r>
-      <w:hyperlink r:id="rId13" w:history="1">
+      <w:hyperlink r:id="rId14" w:history="1">
         <w:r>
           <w:rPr>
             <w:rStyle w:val="Hyperlink"/>
@@ -9185,7 +9274,19 @@
         <w:rPr>
           <w:rFonts w:ascii="Calibri" w:hAnsi="Calibri" w:cs="Calibri"/>
         </w:rPr>
-        <w:t>the new analysis represent a</w:t>
+        <w:t xml:space="preserve">the new analysis </w:t>
+      </w:r>
+      <w:r>
+        <w:rPr>
+          <w:rFonts w:ascii="Calibri" w:hAnsi="Calibri" w:cs="Calibri"/>
+        </w:rPr>
+        <w:t>represents</w:t>
+      </w:r>
+      <w:r>
+        <w:rPr>
+          <w:rFonts w:ascii="Calibri" w:hAnsi="Calibri" w:cs="Calibri"/>
+        </w:rPr>
+        <w:t xml:space="preserve"> a</w:t>
       </w:r>
       <w:r>
         <w:rPr>
@@ -9363,7 +9464,7 @@
         <w:rPr>
           <w:rFonts w:ascii="Calibri" w:hAnsi="Calibri" w:cs="Calibri"/>
         </w:rPr>
-        <w:t xml:space="preserve">=12]) or </w:t>
+        <w:t xml:space="preserve">=12) or </w:t>
       </w:r>
       <w:r>
         <w:rPr>
@@ -9417,6 +9518,12 @@
         <w:rPr>
           <w:rFonts w:ascii="Calibri" w:hAnsi="Calibri" w:cs="Calibri"/>
         </w:rPr>
+        <w:t>,</w:t>
+      </w:r>
+      <w:r>
+        <w:rPr>
+          <w:rFonts w:ascii="Calibri" w:hAnsi="Calibri" w:cs="Calibri"/>
+        </w:rPr>
         <w:t xml:space="preserve"> </w:t>
       </w:r>
       <w:r>
@@ -9429,7 +9536,7 @@
         <w:rPr>
           <w:rFonts w:ascii="Calibri" w:hAnsi="Calibri" w:cs="Calibri"/>
         </w:rPr>
-        <w:t xml:space="preserve"> = 11)</w:t>
+        <w:t>=11)</w:t>
       </w:r>
       <w:r>
         <w:rPr>
@@ -9460,6 +9567,12 @@
           <w:rFonts w:ascii="Calibri" w:hAnsi="Calibri" w:cs="Calibri"/>
         </w:rPr>
         <w:t xml:space="preserve"> </w:t>
+      </w:r>
+      <w:r>
+        <w:rPr>
+          <w:rFonts w:ascii="Calibri" w:hAnsi="Calibri" w:cs="Calibri"/>
+        </w:rPr>
+        <w:t xml:space="preserve">was </w:t>
       </w:r>
       <w:r>
         <w:rPr>
@@ -10737,7 +10850,7 @@
         <w:rPr>
           <w:rFonts w:ascii="Calibri" w:hAnsi="Calibri" w:cs="Calibri"/>
         </w:rPr>
-        <w:t>contact injury during in the third week of the study</w:t>
+        <w:t>contact injury during the third week of the study</w:t>
       </w:r>
       <w:r>
         <w:rPr>
@@ -10827,7 +10940,13 @@
         <w:rPr>
           <w:rFonts w:ascii="Calibri" w:hAnsi="Calibri" w:cs="Calibri"/>
         </w:rPr>
-        <w:t xml:space="preserve">of </w:t>
+        <w:t>on</w:t>
+      </w:r>
+      <w:r>
+        <w:rPr>
+          <w:rFonts w:ascii="Calibri" w:hAnsi="Calibri" w:cs="Calibri"/>
+        </w:rPr>
+        <w:t xml:space="preserve"> </w:t>
       </w:r>
       <w:r>
         <w:rPr>
@@ -11111,7 +11230,19 @@
         <w:rPr>
           <w:rFonts w:ascii="Calibri" w:hAnsi="Calibri" w:cs="Calibri"/>
         </w:rPr>
-        <w:t>. We compared two models, 1) fixed effect of group, training mode (repeated-sprint training, matches, soccer training, gym-based training), dRPE measure (dRPE-L, dRPE-B), and session number (</w:t>
+        <w:t>. We compared two models</w:t>
+      </w:r>
+      <w:r>
+        <w:rPr>
+          <w:rFonts w:ascii="Calibri" w:hAnsi="Calibri" w:cs="Calibri"/>
+        </w:rPr>
+        <w:t>:</w:t>
+      </w:r>
+      <w:r>
+        <w:rPr>
+          <w:rFonts w:ascii="Calibri" w:hAnsi="Calibri" w:cs="Calibri"/>
+        </w:rPr>
+        <w:t xml:space="preserve"> 1) fixed effect of group, training mode (repeated-sprint training, matches, soccer training, gym-based training), dRPE measure (dRPE-L, dRPE-B), and session number (</w:t>
       </w:r>
       <w:r>
         <w:rPr>
@@ -11147,7 +11278,19 @@
         <w:rPr>
           <w:rFonts w:ascii="Calibri" w:hAnsi="Calibri" w:cs="Calibri"/>
         </w:rPr>
-        <w:t xml:space="preserve"> ICC of only 0.016 and a between-player standard deviation of 0.6 (95%CI 0.0, 1.0) AU shows that player explained little heterogeneity in </w:t>
+        <w:t xml:space="preserve"> ICC of only 0.016 and a between-player standard deviation of 0.6 (95%CI 0.0, 1.0) AU shows that </w:t>
+      </w:r>
+      <w:r>
+        <w:rPr>
+          <w:rFonts w:ascii="Calibri" w:hAnsi="Calibri" w:cs="Calibri"/>
+        </w:rPr>
+        <w:t xml:space="preserve">the </w:t>
+      </w:r>
+      <w:r>
+        <w:rPr>
+          <w:rFonts w:ascii="Calibri" w:hAnsi="Calibri" w:cs="Calibri"/>
+        </w:rPr>
+        <w:t xml:space="preserve">player explained little heterogeneity in </w:t>
       </w:r>
       <w:r>
         <w:rPr>
@@ -11496,6 +11639,12 @@
         <w:rPr>
           <w:rFonts w:ascii="Calibri" w:hAnsi="Calibri" w:cs="Calibri"/>
         </w:rPr>
+        <w:t>,</w:t>
+      </w:r>
+      <w:r>
+        <w:rPr>
+          <w:rFonts w:ascii="Calibri" w:hAnsi="Calibri" w:cs="Calibri"/>
+        </w:rPr>
         <w:t xml:space="preserve"> values</w:t>
       </w:r>
       <w:r>
@@ -11854,7 +12003,31 @@
         <w:rPr>
           <w:rFonts w:ascii="Calibri" w:hAnsi="Calibri" w:cs="Calibri"/>
         </w:rPr>
-        <w:t xml:space="preserve"> the original units which maximises practical context </w:t>
+        <w:t xml:space="preserve"> the original units</w:t>
+      </w:r>
+      <w:r>
+        <w:rPr>
+          <w:rFonts w:ascii="Calibri" w:hAnsi="Calibri" w:cs="Calibri"/>
+        </w:rPr>
+        <w:t>,</w:t>
+      </w:r>
+      <w:r>
+        <w:rPr>
+          <w:rFonts w:ascii="Calibri" w:hAnsi="Calibri" w:cs="Calibri"/>
+        </w:rPr>
+        <w:t xml:space="preserve"> which maximises </w:t>
+      </w:r>
+      <w:r>
+        <w:rPr>
+          <w:rFonts w:ascii="Calibri" w:hAnsi="Calibri" w:cs="Calibri"/>
+        </w:rPr>
+        <w:t xml:space="preserve">the </w:t>
+      </w:r>
+      <w:r>
+        <w:rPr>
+          <w:rFonts w:ascii="Calibri" w:hAnsi="Calibri" w:cs="Calibri"/>
+        </w:rPr>
+        <w:t xml:space="preserve">practical context </w:t>
       </w:r>
       <w:r>
         <w:rPr>
@@ -11949,10 +12122,10 @@
                     <pic:cNvPicPr/>
                   </pic:nvPicPr>
                   <pic:blipFill rotWithShape="1">
-                    <a:blip r:embed="rId14">
+                    <a:blip r:embed="rId15">
                       <a:extLst>
                         <a:ext uri="{96DAC541-7B7A-43D3-8B79-37D633B846F1}">
-                          <asvg:svgBlip xmlns:asvg="http://schemas.microsoft.com/office/drawing/2016/SVG/main" r:embed="rId15"/>
+                          <asvg:svgBlip xmlns:asvg="http://schemas.microsoft.com/office/drawing/2016/SVG/main" r:embed="rId16"/>
                         </a:ext>
                       </a:extLst>
                     </a:blip>
@@ -12151,6 +12324,12 @@
         <w:rPr>
           <w:rFonts w:ascii="Calibri" w:hAnsi="Calibri" w:cs="Calibri"/>
         </w:rPr>
+        <w:t>,</w:t>
+      </w:r>
+      <w:r>
+        <w:rPr>
+          <w:rFonts w:ascii="Calibri" w:hAnsi="Calibri" w:cs="Calibri"/>
+        </w:rPr>
         <w:t xml:space="preserve"> and w</w:t>
       </w:r>
       <w:r>
@@ -12199,6 +12378,12 @@
         <w:rPr>
           <w:rFonts w:ascii="Calibri" w:hAnsi="Calibri" w:cs="Calibri"/>
         </w:rPr>
+        <w:t>,</w:t>
+      </w:r>
+      <w:r>
+        <w:rPr>
+          <w:rFonts w:ascii="Calibri" w:hAnsi="Calibri" w:cs="Calibri"/>
+        </w:rPr>
         <w:t xml:space="preserve"> </w:t>
       </w:r>
       <w:r>
@@ -12259,13 +12444,13 @@
         <w:rPr>
           <w:rFonts w:ascii="Calibri" w:hAnsi="Calibri" w:cs="Calibri"/>
         </w:rPr>
-        <w:t>ne-way ANCOVA</w:t>
-      </w:r>
-      <w:r>
-        <w:rPr>
-          <w:rFonts w:ascii="Calibri" w:hAnsi="Calibri" w:cs="Calibri"/>
-        </w:rPr>
-        <w:t>’s</w:t>
+        <w:t xml:space="preserve">ne-way </w:t>
+      </w:r>
+      <w:r>
+        <w:rPr>
+          <w:rFonts w:ascii="Calibri" w:hAnsi="Calibri" w:cs="Calibri"/>
+        </w:rPr>
+        <w:t>ANCOVAs</w:t>
       </w:r>
       <w:r>
         <w:rPr>
@@ -12363,10 +12548,10 @@
                     <pic:cNvPicPr/>
                   </pic:nvPicPr>
                   <pic:blipFill>
-                    <a:blip r:embed="rId16">
+                    <a:blip r:embed="rId17">
                       <a:extLst>
                         <a:ext uri="{96DAC541-7B7A-43D3-8B79-37D633B846F1}">
-                          <asvg:svgBlip xmlns:asvg="http://schemas.microsoft.com/office/drawing/2016/SVG/main" r:embed="rId17"/>
+                          <asvg:svgBlip xmlns:asvg="http://schemas.microsoft.com/office/drawing/2016/SVG/main" r:embed="rId18"/>
                         </a:ext>
                       </a:extLst>
                     </a:blip>
@@ -12496,10 +12681,10 @@
                     <pic:cNvPicPr/>
                   </pic:nvPicPr>
                   <pic:blipFill>
-                    <a:blip r:embed="rId18">
+                    <a:blip r:embed="rId19">
                       <a:extLst>
                         <a:ext uri="{96DAC541-7B7A-43D3-8B79-37D633B846F1}">
-                          <asvg:svgBlip xmlns:asvg="http://schemas.microsoft.com/office/drawing/2016/SVG/main" r:embed="rId19"/>
+                          <asvg:svgBlip xmlns:asvg="http://schemas.microsoft.com/office/drawing/2016/SVG/main" r:embed="rId20"/>
                         </a:ext>
                       </a:extLst>
                     </a:blip>
@@ -12865,10 +13050,10 @@
                     <pic:cNvPicPr/>
                   </pic:nvPicPr>
                   <pic:blipFill>
-                    <a:blip r:embed="rId20">
+                    <a:blip r:embed="rId21">
                       <a:extLst>
                         <a:ext uri="{96DAC541-7B7A-43D3-8B79-37D633B846F1}">
-                          <asvg:svgBlip xmlns:asvg="http://schemas.microsoft.com/office/drawing/2016/SVG/main" r:embed="rId21"/>
+                          <asvg:svgBlip xmlns:asvg="http://schemas.microsoft.com/office/drawing/2016/SVG/main" r:embed="rId22"/>
                         </a:ext>
                       </a:extLst>
                     </a:blip>
@@ -12951,10 +13136,10 @@
                     <pic:cNvPicPr/>
                   </pic:nvPicPr>
                   <pic:blipFill>
-                    <a:blip r:embed="rId22">
+                    <a:blip r:embed="rId23">
                       <a:extLst>
                         <a:ext uri="{96DAC541-7B7A-43D3-8B79-37D633B846F1}">
-                          <asvg:svgBlip xmlns:asvg="http://schemas.microsoft.com/office/drawing/2016/SVG/main" r:embed="rId23"/>
+                          <asvg:svgBlip xmlns:asvg="http://schemas.microsoft.com/office/drawing/2016/SVG/main" r:embed="rId24"/>
                         </a:ext>
                       </a:extLst>
                     </a:blip>
@@ -13126,13 +13311,21 @@
         <w:rPr>
           <w:rFonts w:ascii="Calibri" w:hAnsi="Calibri" w:cs="Calibri"/>
         </w:rPr>
-        <w:t>of</w:t>
-      </w:r>
-      <w:r>
-        <w:rPr>
-          <w:rFonts w:ascii="Calibri" w:hAnsi="Calibri" w:cs="Calibri"/>
-        </w:rPr>
-        <w:t xml:space="preserve"> the training (Mujika, 2013)</w:t>
+        <w:t>on the training (</w:t>
+      </w:r>
+      <w:proofErr w:type="spellStart"/>
+      <w:r>
+        <w:rPr>
+          <w:rFonts w:ascii="Calibri" w:hAnsi="Calibri" w:cs="Calibri"/>
+        </w:rPr>
+        <w:t>Mujika</w:t>
+      </w:r>
+      <w:proofErr w:type="spellEnd"/>
+      <w:r>
+        <w:rPr>
+          <w:rFonts w:ascii="Calibri" w:hAnsi="Calibri" w:cs="Calibri"/>
+        </w:rPr>
+        <w:t>, 2013),</w:t>
       </w:r>
       <w:r>
         <w:rPr>
@@ -13252,7 +13445,19 @@
         <w:rPr>
           <w:rFonts w:ascii="Calibri" w:hAnsi="Calibri" w:cs="Calibri"/>
         </w:rPr>
-        <w:t xml:space="preserve">recent work has shown a linear relationship between fidelity and treatment effects with higher degrees of fidelity associated with smaller yet more precise estimates </w:t>
+        <w:t>recent work has shown a linear relationship between fidelity and treatment effects</w:t>
+      </w:r>
+      <w:r>
+        <w:rPr>
+          <w:rFonts w:ascii="Calibri" w:hAnsi="Calibri" w:cs="Calibri"/>
+        </w:rPr>
+        <w:t>,</w:t>
+      </w:r>
+      <w:r>
+        <w:rPr>
+          <w:rFonts w:ascii="Calibri" w:hAnsi="Calibri" w:cs="Calibri"/>
+        </w:rPr>
+        <w:t xml:space="preserve"> with higher degrees of fidelity associated with smaller yet more precise estimates </w:t>
       </w:r>
       <w:r>
         <w:rPr>
@@ -13324,7 +13529,13 @@
         <w:rPr>
           <w:rFonts w:ascii="Calibri" w:hAnsi="Calibri" w:cs="Calibri"/>
         </w:rPr>
-        <w:t xml:space="preserve">shows </w:t>
+        <w:t>show</w:t>
+      </w:r>
+      <w:r>
+        <w:rPr>
+          <w:rFonts w:ascii="Calibri" w:hAnsi="Calibri" w:cs="Calibri"/>
+        </w:rPr>
+        <w:t xml:space="preserve"> </w:t>
       </w:r>
       <w:r>
         <w:rPr>
@@ -13492,6 +13703,12 @@
         <w:rPr>
           <w:rFonts w:ascii="Calibri" w:hAnsi="Calibri" w:cs="Calibri"/>
         </w:rPr>
+        <w:t>,</w:t>
+      </w:r>
+      <w:r>
+        <w:rPr>
+          <w:rFonts w:ascii="Calibri" w:hAnsi="Calibri" w:cs="Calibri"/>
+        </w:rPr>
         <w:t xml:space="preserve"> </w:t>
       </w:r>
       <w:r>
@@ -13552,19 +13769,13 @@
         <w:rPr>
           <w:rFonts w:ascii="Calibri" w:hAnsi="Calibri" w:cs="Calibri"/>
         </w:rPr>
-        <w:t xml:space="preserve">both </w:t>
-      </w:r>
-      <w:r>
-        <w:rPr>
-          <w:rFonts w:ascii="Calibri" w:hAnsi="Calibri" w:cs="Calibri"/>
-        </w:rPr>
-        <w:t xml:space="preserve">our </w:t>
-      </w:r>
-      <w:r>
-        <w:rPr>
-          <w:rFonts w:ascii="Calibri" w:hAnsi="Calibri" w:cs="Calibri"/>
-        </w:rPr>
-        <w:t xml:space="preserve">protocols were conditioning methods perceived as “very hard”, fluctuating between “moderate” to </w:t>
+        <w:t>that both our protocols were conditioning methods perceived as “very hard”, fluctuating between “moderate” and</w:t>
+      </w:r>
+      <w:r>
+        <w:rPr>
+          <w:rFonts w:ascii="Calibri" w:hAnsi="Calibri" w:cs="Calibri"/>
+        </w:rPr>
+        <w:t xml:space="preserve"> </w:t>
       </w:r>
       <w:r>
         <w:rPr>
@@ -13797,7 +14008,13 @@
         <w:rPr>
           <w:rFonts w:ascii="Calibri" w:hAnsi="Calibri" w:cs="Calibri"/>
         </w:rPr>
-        <w:t xml:space="preserve">aligns </w:t>
+        <w:t>align</w:t>
+      </w:r>
+      <w:r>
+        <w:rPr>
+          <w:rFonts w:ascii="Calibri" w:hAnsi="Calibri" w:cs="Calibri"/>
+        </w:rPr>
+        <w:t xml:space="preserve"> </w:t>
       </w:r>
       <w:r>
         <w:rPr>
@@ -13989,7 +14206,19 @@
         <w:rPr>
           <w:rFonts w:ascii="Calibri" w:hAnsi="Calibri" w:cs="Calibri"/>
         </w:rPr>
-        <w:t>between-group differences in fitness changes</w:t>
+        <w:t xml:space="preserve">between-group </w:t>
+      </w:r>
+      <w:r>
+        <w:rPr>
+          <w:rFonts w:ascii="Calibri" w:hAnsi="Calibri" w:cs="Calibri"/>
+        </w:rPr>
+        <w:t>difference</w:t>
+      </w:r>
+      <w:r>
+        <w:rPr>
+          <w:rFonts w:ascii="Calibri" w:hAnsi="Calibri" w:cs="Calibri"/>
+        </w:rPr>
+        <w:t xml:space="preserve"> in fitness changes</w:t>
       </w:r>
       <w:r>
         <w:rPr>
@@ -14032,6 +14261,12 @@
           <w:rFonts w:ascii="Calibri" w:hAnsi="Calibri" w:cs="Calibri"/>
         </w:rPr>
         <w:t>, vertical jumping ability and maximal aerobic speed</w:t>
+      </w:r>
+      <w:r>
+        <w:rPr>
+          <w:rFonts w:ascii="Calibri" w:hAnsi="Calibri" w:cs="Calibri"/>
+        </w:rPr>
+        <w:t>,</w:t>
       </w:r>
       <w:r>
         <w:rPr>
@@ -14423,7 +14658,19 @@
         <w:rPr>
           <w:rFonts w:ascii="Calibri" w:hAnsi="Calibri" w:cs="Calibri"/>
         </w:rPr>
-        <w:t>help contribute to future meta-analyses examining the moderating influence of manipulating within- and between-set rest times – both of which provide practitioners with programming flexibility – as this has so far been beyond the reach of existing meta-analysis on the chronic effects of repeated-sprint training (Taylor et al., 2015; Thurlow et al., 2024).</w:t>
+        <w:t xml:space="preserve">help contribute to future meta-analyses examining the moderating influence of manipulating within- and between-set rest times – both of which provide practitioners with programming flexibility – as this has so far been beyond the reach of existing </w:t>
+      </w:r>
+      <w:r>
+        <w:rPr>
+          <w:rFonts w:ascii="Calibri" w:hAnsi="Calibri" w:cs="Calibri"/>
+        </w:rPr>
+        <w:t>meta-analyses</w:t>
+      </w:r>
+      <w:r>
+        <w:rPr>
+          <w:rFonts w:ascii="Calibri" w:hAnsi="Calibri" w:cs="Calibri"/>
+        </w:rPr>
+        <w:t xml:space="preserve"> on the chronic effects of repeated-sprint training (Taylor et al., 2015; Thurlow et al., 2024).</w:t>
       </w:r>
     </w:p>
     <w:p>
@@ -14551,6 +14798,12 @@
         <w:rPr>
           <w:rFonts w:ascii="Calibri" w:hAnsi="Calibri" w:cs="Calibri"/>
         </w:rPr>
+        <w:t xml:space="preserve">the </w:t>
+      </w:r>
+      <w:r>
+        <w:rPr>
+          <w:rFonts w:ascii="Calibri" w:hAnsi="Calibri" w:cs="Calibri"/>
+        </w:rPr>
         <w:t xml:space="preserve">pre-season </w:t>
       </w:r>
       <w:r>
@@ -14635,7 +14888,19 @@
         <w:rPr>
           <w:rFonts w:ascii="Calibri" w:hAnsi="Calibri" w:cs="Calibri"/>
         </w:rPr>
-        <w:t xml:space="preserve"> time and resources on measuring physiological and biomechanical responses that may subtend adaptations.</w:t>
+        <w:t xml:space="preserve"> time and resources </w:t>
+      </w:r>
+      <w:r>
+        <w:rPr>
+          <w:rFonts w:ascii="Calibri" w:hAnsi="Calibri" w:cs="Calibri"/>
+        </w:rPr>
+        <w:t>in</w:t>
+      </w:r>
+      <w:r>
+        <w:rPr>
+          <w:rFonts w:ascii="Calibri" w:hAnsi="Calibri" w:cs="Calibri"/>
+        </w:rPr>
+        <w:t xml:space="preserve"> measuring physiological and biomechanical responses that may subtend adaptations.</w:t>
       </w:r>
       <w:r>
         <w:rPr>
@@ -14677,6 +14942,12 @@
         <w:rPr>
           <w:rFonts w:ascii="Calibri" w:hAnsi="Calibri" w:cs="Calibri"/>
         </w:rPr>
+        <w:t xml:space="preserve">the </w:t>
+      </w:r>
+      <w:r>
+        <w:rPr>
+          <w:rFonts w:ascii="Calibri" w:hAnsi="Calibri" w:cs="Calibri"/>
+        </w:rPr>
         <w:t xml:space="preserve">collection of </w:t>
       </w:r>
       <w:r>
@@ -14725,19 +14996,19 @@
         <w:rPr>
           <w:rFonts w:ascii="Calibri" w:hAnsi="Calibri" w:cs="Calibri"/>
         </w:rPr>
-        <w:t>not objectively verified beyond the ‘coaches eye’</w:t>
-      </w:r>
-      <w:r>
-        <w:rPr>
-          <w:rFonts w:ascii="Calibri" w:hAnsi="Calibri" w:cs="Calibri"/>
-        </w:rPr>
-        <w:t xml:space="preserve"> and dRPE</w:t>
-      </w:r>
-      <w:r>
-        <w:rPr>
-          <w:rFonts w:ascii="Calibri" w:hAnsi="Calibri" w:cs="Calibri"/>
-        </w:rPr>
-        <w:t>. Finally, although overall training exposure was intended to be identical bar intervention variations</w:t>
+        <w:t>not objectively verified beyond the ‘</w:t>
+      </w:r>
+      <w:r>
+        <w:rPr>
+          <w:rFonts w:ascii="Calibri" w:hAnsi="Calibri" w:cs="Calibri"/>
+        </w:rPr>
+        <w:t>coach's</w:t>
+      </w:r>
+      <w:r>
+        <w:rPr>
+          <w:rFonts w:ascii="Calibri" w:hAnsi="Calibri" w:cs="Calibri"/>
+        </w:rPr>
+        <w:t xml:space="preserve"> eye’</w:t>
       </w:r>
       <w:r>
         <w:rPr>
@@ -14745,6 +15016,38 @@
         </w:rPr>
         <w:t xml:space="preserve"> and </w:t>
       </w:r>
+      <w:proofErr w:type="spellStart"/>
+      <w:r>
+        <w:rPr>
+          <w:rFonts w:ascii="Calibri" w:hAnsi="Calibri" w:cs="Calibri"/>
+        </w:rPr>
+        <w:t>dRPE</w:t>
+      </w:r>
+      <w:proofErr w:type="spellEnd"/>
+      <w:r>
+        <w:rPr>
+          <w:rFonts w:ascii="Calibri" w:hAnsi="Calibri" w:cs="Calibri"/>
+        </w:rPr>
+        <w:t>. Finally, although overall training exposure was intended to be identical</w:t>
+      </w:r>
+      <w:r>
+        <w:rPr>
+          <w:rFonts w:ascii="Calibri" w:hAnsi="Calibri" w:cs="Calibri"/>
+        </w:rPr>
+        <w:t>,</w:t>
+      </w:r>
+      <w:r>
+        <w:rPr>
+          <w:rFonts w:ascii="Calibri" w:hAnsi="Calibri" w:cs="Calibri"/>
+        </w:rPr>
+        <w:t xml:space="preserve"> bar intervention variations</w:t>
+      </w:r>
+      <w:r>
+        <w:rPr>
+          <w:rFonts w:ascii="Calibri" w:hAnsi="Calibri" w:cs="Calibri"/>
+        </w:rPr>
+        <w:t xml:space="preserve"> and </w:t>
+      </w:r>
       <w:r>
         <w:rPr>
           <w:rFonts w:ascii="Calibri" w:hAnsi="Calibri" w:cs="Calibri"/>
@@ -14767,7 +15070,13 @@
         <w:rPr>
           <w:rFonts w:ascii="Calibri" w:hAnsi="Calibri" w:cs="Calibri"/>
         </w:rPr>
-        <w:t>, variations in individual soccer-specific session durations or match minutes might have occurred due to team-specific logistics, representing an uncontrolled variable, albeit likely minimal in impact given the equivalent perceived load.</w:t>
+        <w:t>;</w:t>
+      </w:r>
+      <w:r>
+        <w:rPr>
+          <w:rFonts w:ascii="Calibri" w:hAnsi="Calibri" w:cs="Calibri"/>
+        </w:rPr>
+        <w:t xml:space="preserve"> variations in individual soccer-specific session durations or match minutes might have occurred due to team-specific logistics, representing an uncontrolled variable, albeit likely minimal in impact given the equivalent perceived load.</w:t>
       </w:r>
     </w:p>
     <w:p>
@@ -14835,43 +15144,13 @@
         <w:rPr>
           <w:rFonts w:ascii="Calibri" w:hAnsi="Calibri" w:cs="Calibri"/>
         </w:rPr>
-        <w:t>in ne</w:t>
-      </w:r>
-      <w:r>
-        <w:rPr>
-          <w:rFonts w:ascii="Calibri" w:hAnsi="Calibri" w:cs="Calibri"/>
-        </w:rPr>
-        <w:t>eded as</w:t>
-      </w:r>
-      <w:r>
-        <w:rPr>
-          <w:rFonts w:ascii="Calibri" w:hAnsi="Calibri" w:cs="Calibri"/>
-        </w:rPr>
-        <w:t xml:space="preserve"> is establishing population-specific </w:t>
-      </w:r>
-      <w:r>
-        <w:rPr>
-          <w:rFonts w:ascii="Calibri" w:hAnsi="Calibri" w:cs="Calibri"/>
-        </w:rPr>
-        <w:t xml:space="preserve">SESOI </w:t>
-      </w:r>
-      <w:r>
-        <w:rPr>
-          <w:rFonts w:ascii="Calibri" w:hAnsi="Calibri" w:cs="Calibri"/>
-        </w:rPr>
-        <w:t xml:space="preserve">for </w:t>
-      </w:r>
-      <w:r>
-        <w:rPr>
-          <w:rFonts w:ascii="Calibri" w:hAnsi="Calibri" w:cs="Calibri"/>
-        </w:rPr>
-        <w:t xml:space="preserve">fitness </w:t>
-      </w:r>
-      <w:r>
-        <w:rPr>
-          <w:rFonts w:ascii="Calibri" w:hAnsi="Calibri" w:cs="Calibri"/>
-        </w:rPr>
-        <w:t xml:space="preserve">outcomes </w:t>
+        <w:t>is needed as it is establishing population-specific SESOI for fitness outcomes,</w:t>
+      </w:r>
+      <w:r>
+        <w:rPr>
+          <w:rFonts w:ascii="Calibri" w:hAnsi="Calibri" w:cs="Calibri"/>
+        </w:rPr>
+        <w:t xml:space="preserve"> </w:t>
       </w:r>
       <w:r>
         <w:rPr>
@@ -15202,7 +15481,7 @@
         </w:rPr>
         <w:t xml:space="preserve">-Cáceres, F. J., Figueiredo, A., &amp; Fernández-García, J. C. (2020). Train Like You Compete? Physical and Physiological Responses on Semi-Professional Soccer Players. International Journal of Environmental Research and Public Health, 17(3), 756. </w:t>
       </w:r>
-      <w:hyperlink r:id="rId24" w:history="1">
+      <w:hyperlink r:id="rId25" w:history="1">
         <w:r>
           <w:rPr>
             <w:rStyle w:val="Hyperlink"/>
@@ -15230,7 +15509,7 @@
         </w:rPr>
         <w:t xml:space="preserve">Ortigosa-Melero, A., Onetti, W., Figueiredo, A., &amp; Castillo-Rodríguez, A. (2022). Effect of the contextual factors in competition on the performance of semi- professional soccer. Journal of Physical Education and Sport, 22, 2793–2799. </w:t>
       </w:r>
-      <w:hyperlink r:id="rId25" w:history="1">
+      <w:hyperlink r:id="rId26" w:history="1">
         <w:r>
           <w:rPr>
             <w:rStyle w:val="Hyperlink"/>
@@ -15258,7 +15537,7 @@
         </w:rPr>
         <w:t xml:space="preserve">Faude, O., Koch, T., &amp; Meyer, T. (2012). Straight sprinting is the most frequent action in goal situations in professional football. J Sports Sci, 30(7), 625–631. </w:t>
       </w:r>
-      <w:hyperlink r:id="rId26" w:history="1">
+      <w:hyperlink r:id="rId27" w:history="1">
         <w:r>
           <w:rPr>
             <w:rStyle w:val="Hyperlink"/>
@@ -15286,7 +15565,7 @@
         </w:rPr>
         <w:t xml:space="preserve">Taylor, J., Macpherson, T., Spears, I., &amp; Weston, M. (2015). The effects of repeated-sprint training on field-based fitness measures: A meta-analysis of controlled and non-controlled trials. Sports Med, 45(6), 881–891. </w:t>
       </w:r>
-      <w:hyperlink r:id="rId27" w:history="1">
+      <w:hyperlink r:id="rId28" w:history="1">
         <w:r>
           <w:rPr>
             <w:rStyle w:val="Hyperlink"/>
@@ -15314,7 +15593,7 @@
         </w:rPr>
         <w:t xml:space="preserve">Thurlow, F., Huynh, M., Townshend, A., McLaren, S. J., James, L. P., Taylor, J. M., Weston, M., &amp; Weakley, J. (2024). The Effects of Repeated-Sprint Training on Physical Fitness and Physiological Adaptation in Athletes: A Systematic Review and Meta-Analysis. Sports Med. </w:t>
       </w:r>
-      <w:hyperlink r:id="rId28" w:history="1">
+      <w:hyperlink r:id="rId29" w:history="1">
         <w:r>
           <w:rPr>
             <w:rStyle w:val="Hyperlink"/>
@@ -15342,7 +15621,7 @@
         </w:rPr>
         <w:t xml:space="preserve">Thurlow, F., Weakley, J., Townshend, A. D., Timmins, R. G., Morrison, M., &amp; McLaren, S. J. (2023). The Acute Demands of Repeated-Sprint Training on Physiological, Neuromuscular, Perceptual and Performance Outcomes in Team Sport Athletes: A Systematic Review and Meta-analysis. Sports Medicine, 53(8), 1609–1640. </w:t>
       </w:r>
-      <w:hyperlink r:id="rId29" w:history="1">
+      <w:hyperlink r:id="rId30" w:history="1">
         <w:r>
           <w:rPr>
             <w:rStyle w:val="Hyperlink"/>
@@ -15370,7 +15649,7 @@
         </w:rPr>
         <w:t xml:space="preserve">Thurlow, F., McLaren, S. J., Townshend, A., &amp; Weakley, J. (2025). The Application of Repeated-Sprint Training. Strength and Conditioning Journal, 47(4), 398–413. </w:t>
       </w:r>
-      <w:hyperlink r:id="rId30" w:history="1">
+      <w:hyperlink r:id="rId31" w:history="1">
         <w:r>
           <w:rPr>
             <w:rStyle w:val="Hyperlink"/>
@@ -15412,7 +15691,7 @@
         </w:rPr>
         <w:t xml:space="preserve"> One, 12(2), e0171462. </w:t>
       </w:r>
-      <w:hyperlink r:id="rId31" w:history="1">
+      <w:hyperlink r:id="rId32" w:history="1">
         <w:r>
           <w:rPr>
             <w:rStyle w:val="Hyperlink"/>
@@ -15482,7 +15761,7 @@
         </w:rPr>
         <w:t xml:space="preserve">, V. (2011). Muscle metabolism and performance improvement after two training programmes of sprint running differing in rest interval duration. J Sports Sci, 29(11), 1167–1174. </w:t>
       </w:r>
-      <w:hyperlink r:id="rId32" w:history="1">
+      <w:hyperlink r:id="rId33" w:history="1">
         <w:r>
           <w:rPr>
             <w:rStyle w:val="Hyperlink"/>
@@ -15510,7 +15789,7 @@
         </w:rPr>
         <w:t xml:space="preserve">Taylor, J. M., Macpherson, T. W., Spears, I. R., &amp; Weston, M. (2016). Repeated Sprints: An Independent Not Dependent Variable. International Journal of Sports Physiology and Performance, 11(5), 693–696. </w:t>
       </w:r>
-      <w:hyperlink r:id="rId33" w:history="1">
+      <w:hyperlink r:id="rId34" w:history="1">
         <w:r>
           <w:rPr>
             <w:rStyle w:val="Hyperlink"/>
@@ -15608,7 +15887,7 @@
         </w:rPr>
         <w:t xml:space="preserve">, D. R., Farmer, A. J., Fergusson, D. A., Golub, R. M., Goodman, S. N., … Hróbjartsson, A. (2025). SPIRIT 2025 statement: updated guideline for protocols of randomised trials. The Lancet, 405(10491), e19–e27. </w:t>
       </w:r>
-      <w:hyperlink r:id="rId34" w:history="1">
+      <w:hyperlink r:id="rId35" w:history="1">
         <w:r>
           <w:rPr>
             <w:rStyle w:val="Hyperlink"/>
@@ -15636,7 +15915,7 @@
         </w:rPr>
         <w:t xml:space="preserve">Slade, S. C., Dionne, C. E., Underwood, M., &amp; Buchbinder, R. (2016). Consensus on Exercise Reporting Template (CERT): Explanation and Elaboration Statement. British Journal of Sports Medicine, 50(23), 1428–1437. </w:t>
       </w:r>
-      <w:hyperlink r:id="rId35" w:history="1">
+      <w:hyperlink r:id="rId36" w:history="1">
         <w:r>
           <w:rPr>
             <w:rStyle w:val="Hyperlink"/>
@@ -15678,7 +15957,7 @@
         </w:rPr>
         <w:t xml:space="preserve">, V. L., Sheppard, J., &amp; Burke, L. M. (2022). Defining Training and Performance Caliber: A Participant Classification Framework. International Journal of Sports Physiology and Performance, 17(2), 317–331. </w:t>
       </w:r>
-      <w:hyperlink r:id="rId36" w:history="1">
+      <w:hyperlink r:id="rId37" w:history="1">
         <w:r>
           <w:rPr>
             <w:rStyle w:val="Hyperlink"/>
@@ -15732,7 +16011,7 @@
         <w:lastRenderedPageBreak/>
         <w:t xml:space="preserve">rate indices as measures of cardiorespiratory fitness: A preliminary study in football. J Sci Med Sport. </w:t>
       </w:r>
-      <w:hyperlink r:id="rId37" w:history="1">
+      <w:hyperlink r:id="rId38" w:history="1">
         <w:r>
           <w:rPr>
             <w:rStyle w:val="Hyperlink"/>
@@ -15760,7 +16039,7 @@
         </w:rPr>
         <w:t xml:space="preserve">Borg, E., Borg, G., Larsson, K., Letzter, M., &amp; Sundblad, B.-M. (2010). An index for breathlessness and leg fatigue. Scandinavian Journal of Medicine &amp; Science in Sports, 20(4), 644–650. </w:t>
       </w:r>
-      <w:hyperlink r:id="rId38" w:history="1">
+      <w:hyperlink r:id="rId39" w:history="1">
         <w:r>
           <w:rPr>
             <w:rStyle w:val="Hyperlink"/>
@@ -15788,7 +16067,7 @@
         </w:rPr>
         <w:t xml:space="preserve">Weakley, J., McCosker, C., Chalkley, D., Johnston, R., Munteanu, G., &amp; Morrison, M. (2023). Comparison of Sprint Timing Methods on Performance, and Displacement and Velocity at Timing Initiation. J Strength Cond Res, 37(1), 234–238. </w:t>
       </w:r>
-      <w:hyperlink r:id="rId39" w:history="1">
+      <w:hyperlink r:id="rId40" w:history="1">
         <w:r>
           <w:rPr>
             <w:rStyle w:val="Hyperlink"/>
@@ -15844,7 +16123,7 @@
         </w:rPr>
         <w:t xml:space="preserve">’ strength, balance, and movement assessment tests. Journal of Science and Medicine in Sport. </w:t>
       </w:r>
-      <w:hyperlink r:id="rId40" w:history="1">
+      <w:hyperlink r:id="rId41" w:history="1">
         <w:r>
           <w:rPr>
             <w:rStyle w:val="Hyperlink"/>
@@ -15900,7 +16179,7 @@
         </w:rPr>
         <w:t xml:space="preserve">, 115(12), 2593–2598. </w:t>
       </w:r>
-      <w:hyperlink r:id="rId41" w:history="1">
+      <w:hyperlink r:id="rId42" w:history="1">
         <w:r>
           <w:rPr>
             <w:rStyle w:val="Hyperlink"/>
@@ -15928,7 +16207,7 @@
         </w:rPr>
         <w:t xml:space="preserve">Abt, G., Boreham, C., Davison, G., Jackson, R., Jobson, S., Wallace, E., &amp; Williams, M. (2025). Sample size estimation revisited. Journal of Sports Sciences, ahead-of-print(ahead-of-print), 1–6. </w:t>
       </w:r>
-      <w:hyperlink r:id="rId42" w:history="1">
+      <w:hyperlink r:id="rId43" w:history="1">
         <w:r>
           <w:rPr>
             <w:rStyle w:val="Hyperlink"/>
@@ -15956,7 +16235,7 @@
         </w:rPr>
         <w:t xml:space="preserve">Lakens, D. (2022). Sample Size Justification. Collabra: Psychology, 8(1). </w:t>
       </w:r>
-      <w:hyperlink r:id="rId43" w:history="1">
+      <w:hyperlink r:id="rId44" w:history="1">
         <w:r>
           <w:rPr>
             <w:rStyle w:val="Hyperlink"/>
@@ -15984,7 +16263,7 @@
         </w:rPr>
         <w:t xml:space="preserve">Cook, J. A., Julious, S. A., Sones, W., Hampson, L. V., Hewitt, C., Berlin, J. A., Ashby, D., Emsley, R., Fergusson, D. A., Walters, S. J., Wilson, E. C. F., MacLennan, G., Stallard, N., Rothwell, J. C., Bland, M., Brown, L., Ramsay, C. R., Cook, A., Armstrong, D., … Vale, L. D. (2018). DELTA 2guidance on choosing the target difference and undertaking and reporting the sample size calculation for a randomised controlled trial. BMJ, 363, k3750-7. </w:t>
       </w:r>
-      <w:hyperlink r:id="rId44" w:history="1">
+      <w:hyperlink r:id="rId45" w:history="1">
         <w:r>
           <w:rPr>
             <w:rStyle w:val="Hyperlink"/>
@@ -16012,7 +16291,7 @@
         </w:rPr>
         <w:t xml:space="preserve">Datson, N., Lolli, L., Drust, B., Atkinson, G., Weston, M., &amp; Gregson, W. (2022). Inter-methodological quantification of the target change for performance test outcomes relevant to elite female soccer players. Science and Medicine in Football, 6(2), 248–261. </w:t>
       </w:r>
-      <w:hyperlink r:id="rId45" w:history="1">
+      <w:hyperlink r:id="rId46" w:history="1">
         <w:r>
           <w:rPr>
             <w:rStyle w:val="Hyperlink"/>
@@ -16054,7 +16333,7 @@
         </w:rPr>
         <w:t xml:space="preserve">, J., &amp; Seiler, S. (2014). The role and development of sprinting speed in soccer. International Journal of Sports Physiology and Performance, 9(3), 432–441. </w:t>
       </w:r>
-      <w:hyperlink r:id="rId46" w:history="1">
+      <w:hyperlink r:id="rId47" w:history="1">
         <w:r>
           <w:rPr>
             <w:rStyle w:val="Hyperlink"/>
@@ -16082,7 +16361,7 @@
         </w:rPr>
         <w:t xml:space="preserve">Haugen, T., &amp; Buchheit, M. (2016). Sprint Running Performance Monitoring: Methodological and Practical Considerations. Sports Medicine, 46(5), 641–656. </w:t>
       </w:r>
-      <w:hyperlink r:id="rId47" w:history="1">
+      <w:hyperlink r:id="rId48" w:history="1">
         <w:r>
           <w:rPr>
             <w:rStyle w:val="Hyperlink"/>
@@ -16124,7 +16403,7 @@
         </w:rPr>
         <w:t xml:space="preserve">, F., &amp; Seiler, S. (2020). Sprint mechanical properties in soccer players according to playing standard, position, age and sex. Journal of Sports Sciences, 38(9), 1070–1076. </w:t>
       </w:r>
-      <w:hyperlink r:id="rId48" w:history="1">
+      <w:hyperlink r:id="rId49" w:history="1">
         <w:r>
           <w:rPr>
             <w:rStyle w:val="Hyperlink"/>
@@ -16152,7 +16431,7 @@
         </w:rPr>
         <w:t xml:space="preserve">Taylor, J. M., Madden, J. L., Cunningham, L. P., &amp; Wright, M. (2022). Fitness Testing in Soccer Revisited: Developing a Contemporary Testing Battery. Strength and Conditioning Journal, 44(5), 10–21. </w:t>
       </w:r>
-      <w:hyperlink r:id="rId49" w:history="1">
+      <w:hyperlink r:id="rId50" w:history="1">
         <w:r>
           <w:rPr>
             <w:rStyle w:val="Hyperlink"/>
@@ -16180,7 +16459,7 @@
         </w:rPr>
         <w:t xml:space="preserve">Lakens, D., &amp; Caldwell, A. R. (2021). Simulation-Based Power Analysis for Factorial Analysis of Variance Designs. Advances in Methods and Practices in Psychological Science, 4(1), 2515245920951503. </w:t>
       </w:r>
-      <w:hyperlink r:id="rId50" w:history="1">
+      <w:hyperlink r:id="rId51" w:history="1">
         <w:r>
           <w:rPr>
             <w:rStyle w:val="Hyperlink"/>
@@ -16208,7 +16487,7 @@
         </w:rPr>
         <w:t xml:space="preserve">Collins, K. A., Huffman, K. M., Wolever, R. Q., Smith, P. J., Siegler, I. C., Ross, L. M., Hauser, E. R., Jiang, R., Jakicic, J. M., Costa, P. T., &amp; Kraus, W. E. (2022). Determinants of Dropout from and Variation in Adherence to an Exercise Intervention: The STRRIDE Randomized Trials. Translational Journal of the ACSM, 7(1), e000190. </w:t>
       </w:r>
-      <w:hyperlink r:id="rId51" w:history="1">
+      <w:hyperlink r:id="rId52" w:history="1">
         <w:r>
           <w:rPr>
             <w:rStyle w:val="Hyperlink"/>
@@ -16236,7 +16515,7 @@
         </w:rPr>
         <w:t xml:space="preserve">Altman, D. G., &amp; Bland, J. M. (2005). Treatment allocation by minimisation. BMJ, 330(7495), 843. </w:t>
       </w:r>
-      <w:hyperlink r:id="rId52" w:history="1">
+      <w:hyperlink r:id="rId53" w:history="1">
         <w:r>
           <w:rPr>
             <w:rStyle w:val="Hyperlink"/>
@@ -16331,7 +16610,7 @@
         </w:rPr>
         <w:t xml:space="preserve"> Perform, 11(3), 404–406. </w:t>
       </w:r>
-      <w:hyperlink r:id="rId53" w:history="1">
+      <w:hyperlink r:id="rId54" w:history="1">
         <w:r>
           <w:rPr>
             <w:rStyle w:val="Hyperlink"/>
@@ -16360,7 +16639,7 @@
         <w:lastRenderedPageBreak/>
         <w:t xml:space="preserve">Tierney, N., &amp; Cook, D. (2023). Expanding Tidy Data Principles to Facilitate Missing Data Exploration, Visualization and Assessment of Imputations. Journal of Statistical Software, 105(7), 1–31. </w:t>
       </w:r>
-      <w:hyperlink r:id="rId54" w:history="1">
+      <w:hyperlink r:id="rId55" w:history="1">
         <w:r>
           <w:rPr>
             <w:rStyle w:val="Hyperlink"/>
@@ -16416,7 +16695,7 @@
         </w:rPr>
         <w:t xml:space="preserve"> ONE, 10(4), e0125166-8. </w:t>
       </w:r>
-      <w:hyperlink r:id="rId55" w:history="1">
+      <w:hyperlink r:id="rId56" w:history="1">
         <w:r>
           <w:rPr>
             <w:rStyle w:val="Hyperlink"/>
@@ -16458,7 +16737,7 @@
         </w:rPr>
         <w:t xml:space="preserve">, M., Bolker, B., &amp; Walker, S. (2015). Fitting Linear Mixed-Effects Models Using lme4. Journal of Statistical Software, 67(1), 1–48. </w:t>
       </w:r>
-      <w:hyperlink r:id="rId56" w:history="1">
+      <w:hyperlink r:id="rId57" w:history="1">
         <w:r>
           <w:rPr>
             <w:rStyle w:val="Hyperlink"/>
@@ -16566,7 +16845,7 @@
         </w:rPr>
         <w:t xml:space="preserve"> Open Research, 4, 63. </w:t>
       </w:r>
-      <w:hyperlink r:id="rId57" w:history="1">
+      <w:hyperlink r:id="rId58" w:history="1">
         <w:r>
           <w:rPr>
             <w:rStyle w:val="Hyperlink"/>
@@ -16608,7 +16887,7 @@
         </w:rPr>
         <w:t xml:space="preserve">: Visualizations of Distributions and Uncertainty in the Grammar of Graphics.” _IEEE Transactions on Visualization and Computer Graphics_, *30*(1), 414-424. doi:10.1109/TVCG.2023.3327195 </w:t>
       </w:r>
-      <w:hyperlink r:id="rId58" w:history="1">
+      <w:hyperlink r:id="rId59" w:history="1">
         <w:r>
           <w:rPr>
             <w:rStyle w:val="Hyperlink"/>
@@ -16636,7 +16915,7 @@
         </w:rPr>
         <w:t xml:space="preserve">Senn, S. (2006). Change from baseline and analysis of covariance revisited. Statistics in Medicine, 25(24), 4334–4344. </w:t>
       </w:r>
-      <w:hyperlink r:id="rId59" w:history="1">
+      <w:hyperlink r:id="rId60" w:history="1">
         <w:r>
           <w:rPr>
             <w:rStyle w:val="Hyperlink"/>
@@ -16711,7 +16990,7 @@
         </w:rPr>
         <w:t xml:space="preserve">: An R package to make the most out of your statistical models through marginal means, marginal effects, and model predictions. Journal of Open Source Software, 10(109), 7969. </w:t>
       </w:r>
-      <w:hyperlink r:id="rId60" w:history="1">
+      <w:hyperlink r:id="rId61" w:history="1">
         <w:r>
           <w:rPr>
             <w:rStyle w:val="Hyperlink"/>
@@ -16739,7 +17018,7 @@
         </w:rPr>
         <w:t xml:space="preserve">Baguley, T. (2009). Standardized or simple effect size: What should be reported? British Journal of Psychology (London, England: 1953), 100(Pt 3), 603–617. </w:t>
       </w:r>
-      <w:hyperlink r:id="rId61" w:history="1">
+      <w:hyperlink r:id="rId62" w:history="1">
         <w:r>
           <w:rPr>
             <w:rStyle w:val="Hyperlink"/>
@@ -16767,7 +17046,7 @@
         </w:rPr>
         <w:t xml:space="preserve">Mujika, I. (2013). The Alphabet of Sport Science Research Starts With Q. International Journal of Sports Physiology and Performance, 8(5), 465–466. </w:t>
       </w:r>
-      <w:hyperlink r:id="rId62" w:history="1">
+      <w:hyperlink r:id="rId63" w:history="1">
         <w:r>
           <w:rPr>
             <w:rStyle w:val="Hyperlink"/>
@@ -16823,7 +17102,7 @@
         </w:rPr>
         <w:t xml:space="preserve"> intervention pilot and feasibility studies. Pilot and Feasibility Studies, 10(1), 57. </w:t>
       </w:r>
-      <w:hyperlink r:id="rId63" w:history="1">
+      <w:hyperlink r:id="rId64" w:history="1">
         <w:r>
           <w:rPr>
             <w:rStyle w:val="Hyperlink"/>
@@ -16865,7 +17144,7 @@
         </w:rPr>
         <w:t xml:space="preserve"> study. Journal of Clinical Epidemiology, 177, 111610. </w:t>
       </w:r>
-      <w:hyperlink r:id="rId64" w:history="1">
+      <w:hyperlink r:id="rId65" w:history="1">
         <w:r>
           <w:rPr>
             <w:rStyle w:val="Hyperlink"/>

</xml_diff>